<commit_message>
Complete DM2026 Lab 1 assignment
</commit_message>
<xml_diff>
--- a/DM2026-Lab1-Master-Questions.docx
+++ b/DM2026-Lab1-Master-Questions.docx
@@ -193,7 +193,33 @@
           <w:b/>
           <w:bCs/>
         </w:rPr>
-        <w:t>English Name:</w:t>
+        <w:t xml:space="preserve">English </w:t>
+      </w:r>
+      <w:proofErr w:type="spellStart"/>
+      <w:r>
+        <w:rPr>
+          <w:rFonts w:ascii="Century Schoolbook" w:hAnsi="Century Schoolbook"/>
+          <w:b/>
+          <w:bCs/>
+        </w:rPr>
+        <w:t>Name:</w:t>
+      </w:r>
+      <w:r>
+        <w:rPr>
+          <w:rFonts w:ascii="Century Schoolbook" w:hAnsi="Century Schoolbook" w:hint="eastAsia"/>
+          <w:b/>
+          <w:bCs/>
+        </w:rPr>
+        <w:t>Hsieh</w:t>
+      </w:r>
+      <w:proofErr w:type="spellEnd"/>
+      <w:r>
+        <w:rPr>
+          <w:rFonts w:ascii="Century Schoolbook" w:hAnsi="Century Schoolbook" w:hint="eastAsia"/>
+          <w:b/>
+          <w:bCs/>
+        </w:rPr>
+        <w:t xml:space="preserve"> Min Hsien (Casper)</w:t>
       </w:r>
     </w:p>
     <w:p>
@@ -215,6 +241,14 @@
         </w:rPr>
         <w:t>Chinese Name:</w:t>
       </w:r>
+      <w:r>
+        <w:rPr>
+          <w:rFonts w:ascii="Century Schoolbook" w:hAnsi="Century Schoolbook" w:hint="eastAsia"/>
+          <w:b/>
+          <w:bCs/>
+        </w:rPr>
+        <w:t>謝旻線</w:t>
+      </w:r>
     </w:p>
     <w:p>
       <w:pPr>
@@ -235,6 +269,14 @@
         </w:rPr>
         <w:t>Email:</w:t>
       </w:r>
+      <w:r>
+        <w:rPr>
+          <w:rFonts w:ascii="Century Schoolbook" w:hAnsi="Century Schoolbook" w:hint="eastAsia"/>
+          <w:b/>
+          <w:bCs/>
+        </w:rPr>
+        <w:t>jk95209@gmail.com</w:t>
+      </w:r>
     </w:p>
     <w:p>
       <w:pPr>
@@ -255,6 +297,14 @@
         </w:rPr>
         <w:t>Student ID:</w:t>
       </w:r>
+      <w:r>
+        <w:rPr>
+          <w:rFonts w:ascii="Century Schoolbook" w:hAnsi="Century Schoolbook" w:hint="eastAsia"/>
+          <w:b/>
+          <w:bCs/>
+        </w:rPr>
+        <w:t>109020030</w:t>
+      </w:r>
     </w:p>
     <w:p>
       <w:pPr>
@@ -267,6 +317,7 @@
           <w:rFonts w:ascii="Century Schoolbook" w:hAnsi="Century Schoolbook"/>
         </w:rPr>
       </w:pPr>
+      <w:proofErr w:type="spellStart"/>
       <w:r>
         <w:rPr>
           <w:rFonts w:ascii="Century Schoolbook" w:hAnsi="Century Schoolbook"/>
@@ -275,6 +326,15 @@
         </w:rPr>
         <w:t>University:</w:t>
       </w:r>
+      <w:r>
+        <w:rPr>
+          <w:rFonts w:ascii="Century Schoolbook" w:hAnsi="Century Schoolbook" w:hint="eastAsia"/>
+          <w:b/>
+          <w:bCs/>
+        </w:rPr>
+        <w:t>NTHU</w:t>
+      </w:r>
+      <w:proofErr w:type="spellEnd"/>
     </w:p>
     <w:p>
       <w:pPr>
@@ -937,7 +997,7 @@
     </w:p>
     <w:p>
       <w:pPr>
-        <w:pStyle w:val="ListParagraph"/>
+        <w:pStyle w:val="a9"/>
         <w:numPr>
           <w:ilvl w:val="0"/>
           <w:numId w:val="15"/>
@@ -978,16 +1038,16 @@
     </w:p>
     <w:p>
       <w:pPr>
-        <w:pStyle w:val="ListParagraph"/>
-        <w:jc w:val="both"/>
-        <w:rPr>
-          <w:rFonts w:ascii="Century Schoolbook" w:hAnsi="Century Schoolbook"/>
-        </w:rPr>
-      </w:pPr>
-    </w:p>
-    <w:p>
-      <w:pPr>
-        <w:pStyle w:val="ListParagraph"/>
+        <w:pStyle w:val="a9"/>
+        <w:jc w:val="both"/>
+        <w:rPr>
+          <w:rFonts w:ascii="Century Schoolbook" w:hAnsi="Century Schoolbook"/>
+        </w:rPr>
+      </w:pPr>
+    </w:p>
+    <w:p>
+      <w:pPr>
+        <w:pStyle w:val="a9"/>
         <w:numPr>
           <w:ilvl w:val="0"/>
           <w:numId w:val="15"/>
@@ -1042,16 +1102,16 @@
     </w:p>
     <w:p>
       <w:pPr>
-        <w:pStyle w:val="ListParagraph"/>
-        <w:jc w:val="both"/>
-        <w:rPr>
-          <w:rFonts w:ascii="Century Schoolbook" w:hAnsi="Century Schoolbook"/>
-        </w:rPr>
-      </w:pPr>
-    </w:p>
-    <w:p>
-      <w:pPr>
-        <w:pStyle w:val="ListParagraph"/>
+        <w:pStyle w:val="a9"/>
+        <w:jc w:val="both"/>
+        <w:rPr>
+          <w:rFonts w:ascii="Century Schoolbook" w:hAnsi="Century Schoolbook"/>
+        </w:rPr>
+      </w:pPr>
+    </w:p>
+    <w:p>
+      <w:pPr>
+        <w:pStyle w:val="a9"/>
         <w:numPr>
           <w:ilvl w:val="0"/>
           <w:numId w:val="15"/>
@@ -1087,21 +1147,7 @@
         <w:rPr>
           <w:rFonts w:ascii="Century Schoolbook" w:hAnsi="Century Schoolbook"/>
         </w:rPr>
-        <w:t xml:space="preserve"> or leave it blank only if you truly did not use AI for that question. References are still encouraged if you </w:t>
-      </w:r>
-      <w:proofErr w:type="gramStart"/>
-      <w:r>
-        <w:rPr>
-          <w:rFonts w:ascii="Century Schoolbook" w:hAnsi="Century Schoolbook"/>
-        </w:rPr>
-        <w:t>looked</w:t>
-      </w:r>
-      <w:proofErr w:type="gramEnd"/>
-      <w:r>
-        <w:rPr>
-          <w:rFonts w:ascii="Century Schoolbook" w:hAnsi="Century Schoolbook"/>
-        </w:rPr>
-        <w:t xml:space="preserve"> anything up.</w:t>
+        <w:t xml:space="preserve"> or leave it blank only if you truly did not use AI for that question. References are still encouraged if you looked anything up.</w:t>
       </w:r>
     </w:p>
     <w:p>
@@ -1502,12 +1548,100 @@
         </w:rPr>
         <w:t>Answer:</w:t>
       </w:r>
-    </w:p>
-    <w:p>
-      <w:pPr>
-        <w:jc w:val="both"/>
-        <w:rPr>
-          <w:rFonts w:ascii="Century Schoolbook" w:hAnsi="Century Schoolbook"/>
+      <w:r>
+        <w:rPr>
+          <w:rFonts w:ascii="Century Schoolbook" w:hAnsi="Century Schoolbook" w:hint="eastAsia"/>
+          <w:b/>
+          <w:bCs/>
+        </w:rPr>
+        <w:t xml:space="preserve"> </w:t>
+      </w:r>
+      <w:r>
+        <w:rPr>
+          <w:rFonts w:ascii="Century Schoolbook" w:hAnsi="Century Schoolbook" w:hint="eastAsia"/>
+        </w:rPr>
+        <w:t>1.594</w:t>
+      </w:r>
+    </w:p>
+    <w:p>
+      <w:pPr>
+        <w:jc w:val="both"/>
+        <w:rPr>
+          <w:rFonts w:ascii="Century Schoolbook" w:hAnsi="Century Schoolbook" w:hint="eastAsia"/>
+        </w:rPr>
+      </w:pPr>
+      <w:r>
+        <w:rPr>
+          <w:rFonts w:ascii="Century Schoolbook" w:hAnsi="Century Schoolbook"/>
+        </w:rPr>
+        <w:tab/>
+      </w:r>
+      <w:r>
+        <w:rPr>
+          <w:rFonts w:ascii="Century Schoolbook" w:hAnsi="Century Schoolbook" w:hint="eastAsia"/>
+        </w:rPr>
+        <w:t xml:space="preserve">     2. Filtering for </w:t>
+      </w:r>
+      <w:proofErr w:type="spellStart"/>
+      <w:r>
+        <w:rPr>
+          <w:rFonts w:ascii="Century Schoolbook" w:hAnsi="Century Schoolbook" w:hint="eastAsia"/>
+        </w:rPr>
+        <w:t>sci.med</w:t>
+      </w:r>
+      <w:proofErr w:type="spellEnd"/>
+      <w:r>
+        <w:rPr>
+          <w:rFonts w:ascii="Century Schoolbook" w:hAnsi="Century Schoolbook" w:hint="eastAsia"/>
+        </w:rPr>
+        <w:t xml:space="preserve"> removes unrelated </w:t>
+      </w:r>
+      <w:proofErr w:type="spellStart"/>
+      <w:r>
+        <w:rPr>
+          <w:rFonts w:ascii="Century Schoolbook" w:hAnsi="Century Schoolbook"/>
+        </w:rPr>
+        <w:t>documents</w:t>
+      </w:r>
+      <w:r>
+        <w:rPr>
+          <w:rFonts w:ascii="Century Schoolbook" w:hAnsi="Century Schoolbook" w:hint="eastAsia"/>
+        </w:rPr>
+        <w:t>,so</w:t>
+      </w:r>
+      <w:proofErr w:type="spellEnd"/>
+      <w:r>
+        <w:rPr>
+          <w:rFonts w:ascii="Century Schoolbook" w:hAnsi="Century Schoolbook" w:hint="eastAsia"/>
+        </w:rPr>
+        <w:t xml:space="preserve"> the algorithm can </w:t>
+      </w:r>
+      <w:proofErr w:type="spellStart"/>
+      <w:r>
+        <w:rPr>
+          <w:rFonts w:ascii="Century Schoolbook" w:hAnsi="Century Schoolbook" w:hint="eastAsia"/>
+        </w:rPr>
+        <w:t>findpatterns</w:t>
+      </w:r>
+      <w:proofErr w:type="spellEnd"/>
+      <w:r>
+        <w:rPr>
+          <w:rFonts w:ascii="Century Schoolbook" w:hAnsi="Century Schoolbook" w:hint="eastAsia"/>
+        </w:rPr>
+        <w:t xml:space="preserve"> that are more relevant to medical topics.</w:t>
+      </w:r>
+      <w:r>
+        <w:rPr>
+          <w:rFonts w:ascii="Century Schoolbook" w:hAnsi="Century Schoolbook"/>
+        </w:rPr>
+        <w:tab/>
+      </w:r>
+    </w:p>
+    <w:p>
+      <w:pPr>
+        <w:jc w:val="both"/>
+        <w:rPr>
+          <w:rFonts w:ascii="Century Schoolbook" w:hAnsi="Century Schoolbook" w:hint="eastAsia"/>
         </w:rPr>
       </w:pPr>
       <w:r>
@@ -1524,12 +1658,24 @@
         </w:rPr>
         <w:t xml:space="preserve"> Yes / No </w:t>
       </w:r>
-    </w:p>
-    <w:p>
-      <w:pPr>
-        <w:jc w:val="both"/>
-        <w:rPr>
-          <w:rFonts w:ascii="Century Schoolbook" w:hAnsi="Century Schoolbook"/>
+      <w:r>
+        <w:rPr>
+          <w:rFonts w:ascii="Century Schoolbook" w:hAnsi="Century Schoolbook" w:hint="eastAsia"/>
+        </w:rPr>
+        <w:t>:</w:t>
+      </w:r>
+      <w:r>
+        <w:rPr>
+          <w:rFonts w:ascii="Century Schoolbook" w:hAnsi="Century Schoolbook" w:hint="eastAsia"/>
+        </w:rPr>
+        <w:t xml:space="preserve"> No</w:t>
+      </w:r>
+    </w:p>
+    <w:p>
+      <w:pPr>
+        <w:jc w:val="both"/>
+        <w:rPr>
+          <w:rFonts w:ascii="Century Schoolbook" w:hAnsi="Century Schoolbook" w:hint="eastAsia"/>
         </w:rPr>
       </w:pPr>
       <w:r>
@@ -1561,6 +1707,14 @@
           <w:bCs/>
         </w:rPr>
         <w:t>External references (links):</w:t>
+      </w:r>
+      <w:r>
+        <w:rPr>
+          <w:rFonts w:ascii="Century Schoolbook" w:hAnsi="Century Schoolbook" w:hint="eastAsia"/>
+          <w:b/>
+          <w:bCs/>
+        </w:rPr>
+        <w:t xml:space="preserve"> none</w:t>
       </w:r>
       <w:r>
         <w:rPr>
@@ -1624,21 +1778,137 @@
         </w:rPr>
         <w:t xml:space="preserve"> Section 4.1 — Question 2 (take home) (after the </w:t>
       </w:r>
-      <w:proofErr w:type="gramStart"/>
-      <w:r>
-        <w:rPr>
-          <w:rFonts w:ascii="Century Schoolbook" w:hAnsi="Century Schoolbook"/>
-          <w:b/>
-          <w:bCs/>
-        </w:rPr>
-        <w:t>dropna(</w:t>
-      </w:r>
-      <w:proofErr w:type="gramEnd"/>
-      <w:r>
-        <w:rPr>
-          <w:rFonts w:ascii="Century Schoolbook" w:hAnsi="Century Schoolbook"/>
-          <w:b/>
-          <w:bCs/>
+      <w:r>
+        <w:rPr>
+          <w:rFonts w:ascii="Century Schoolbook" w:hAnsi="Century Schoolbook"/>
+          <w:b/>
+          <w:bCs/>
+        </w:rPr>
+        <w:t>dropna()</w:t>
+      </w:r>
+      <w:r>
+        <w:rPr>
+          <w:rFonts w:ascii="Century Schoolbook" w:hAnsi="Century Schoolbook"/>
+        </w:rPr>
+        <w:t xml:space="preserve"> demonstration)</w:t>
+      </w:r>
+    </w:p>
+    <w:p>
+      <w:pPr>
+        <w:jc w:val="both"/>
+        <w:rPr>
+          <w:rFonts w:ascii="Century Schoolbook" w:hAnsi="Century Schoolbook"/>
+        </w:rPr>
+      </w:pPr>
+      <w:r>
+        <w:rPr>
+          <w:rFonts w:ascii="Century Schoolbook" w:hAnsi="Century Schoolbook"/>
+          <w:b/>
+          <w:bCs/>
+        </w:rPr>
+        <w:t>Task:</w:t>
+      </w:r>
+      <w:r>
+        <w:rPr>
+          <w:rFonts w:ascii="Century Schoolbook" w:hAnsi="Century Schoolbook"/>
+        </w:rPr>
+        <w:t xml:space="preserve"> </w:t>
+      </w:r>
+      <w:r>
+        <w:rPr>
+          <w:rFonts w:ascii="Century Schoolbook" w:hAnsi="Century Schoolbook"/>
+        </w:rPr>
+        <w:t xml:space="preserve">In Section 4.1, a dummy record with a missing value is injected and then removed using the </w:t>
+      </w:r>
+      <w:proofErr w:type="spellStart"/>
+      <w:r>
+        <w:rPr>
+          <w:rFonts w:ascii="Century Schoolbook" w:hAnsi="Century Schoolbook"/>
+          <w:b/>
+          <w:bCs/>
+        </w:rPr>
+        <w:t>dropna</w:t>
+      </w:r>
+      <w:proofErr w:type="spellEnd"/>
+      <w:r>
+        <w:rPr>
+          <w:rFonts w:ascii="Century Schoolbook" w:hAnsi="Century Schoolbook"/>
+          <w:b/>
+          <w:bCs/>
+        </w:rPr>
+        <w:t>()</w:t>
+      </w:r>
+      <w:r>
+        <w:rPr>
+          <w:rFonts w:ascii="Century Schoolbook" w:hAnsi="Century Schoolbook"/>
+        </w:rPr>
+        <w:t xml:space="preserve"> function.</w:t>
+      </w:r>
+    </w:p>
+    <w:p>
+      <w:pPr>
+        <w:jc w:val="both"/>
+        <w:rPr>
+          <w:rFonts w:ascii="Century Schoolbook" w:hAnsi="Century Schoolbook"/>
+        </w:rPr>
+      </w:pPr>
+      <w:r>
+        <w:rPr>
+          <w:rFonts w:ascii="Century Schoolbook" w:hAnsi="Century Schoolbook"/>
+          <w:b/>
+          <w:bCs/>
+        </w:rPr>
+        <w:t>Question:</w:t>
+      </w:r>
+      <w:r>
+        <w:rPr>
+          <w:rFonts w:ascii="Century Schoolbook" w:hAnsi="Century Schoolbook"/>
+        </w:rPr>
+        <w:t xml:space="preserve"> If 40% of documents were missing the </w:t>
+      </w:r>
+      <w:proofErr w:type="spellStart"/>
+      <w:r>
+        <w:rPr>
+          <w:rFonts w:ascii="Century Schoolbook" w:hAnsi="Century Schoolbook"/>
+          <w:b/>
+          <w:bCs/>
+        </w:rPr>
+        <w:t>category_name</w:t>
+      </w:r>
+      <w:proofErr w:type="spellEnd"/>
+      <w:r>
+        <w:rPr>
+          <w:rFonts w:ascii="Century Schoolbook" w:hAnsi="Century Schoolbook"/>
+        </w:rPr>
+        <w:t xml:space="preserve"> label, why would simply dropping these rows (</w:t>
+      </w:r>
+      <w:r>
+        <w:rPr>
+          <w:rFonts w:ascii="Century Schoolbook" w:hAnsi="Century Schoolbook"/>
+        </w:rPr>
+        <w:t xml:space="preserve">with </w:t>
+      </w:r>
+      <w:proofErr w:type="spellStart"/>
+      <w:r>
+        <w:rPr>
+          <w:rFonts w:ascii="Century Schoolbook" w:hAnsi="Century Schoolbook"/>
+          <w:b/>
+          <w:bCs/>
+        </w:rPr>
+        <w:t>dropna</w:t>
+      </w:r>
+      <w:proofErr w:type="spellEnd"/>
+      <w:r>
+        <w:rPr>
+          <w:rFonts w:ascii="Century Schoolbook" w:hAnsi="Century Schoolbook"/>
+          <w:b/>
+          <w:bCs/>
+        </w:rPr>
+        <w:t>()</w:t>
+      </w:r>
+      <w:r>
+        <w:rPr>
+          <w:rFonts w:ascii="Century Schoolbook" w:hAnsi="Century Schoolbook"/>
         </w:rPr>
         <w:t>)</w:t>
       </w:r>
@@ -1646,23 +1916,105 @@
         <w:rPr>
           <w:rFonts w:ascii="Century Schoolbook" w:hAnsi="Century Schoolbook"/>
         </w:rPr>
-        <w:t xml:space="preserve"> demonstration)</w:t>
-      </w:r>
-    </w:p>
-    <w:p>
-      <w:pPr>
-        <w:jc w:val="both"/>
-        <w:rPr>
-          <w:rFonts w:ascii="Century Schoolbook" w:hAnsi="Century Schoolbook"/>
-        </w:rPr>
-      </w:pPr>
-      <w:r>
-        <w:rPr>
-          <w:rFonts w:ascii="Century Schoolbook" w:hAnsi="Century Schoolbook"/>
-          <w:b/>
-          <w:bCs/>
-        </w:rPr>
-        <w:t>Task:</w:t>
+        <w:t xml:space="preserve"> be a flawed data mining strategy? Name one objective alternative so the text data can still be utilized.</w:t>
+      </w:r>
+    </w:p>
+    <w:p>
+      <w:pPr>
+        <w:jc w:val="both"/>
+        <w:rPr>
+          <w:rFonts w:ascii="Century Schoolbook" w:hAnsi="Century Schoolbook" w:hint="eastAsia"/>
+        </w:rPr>
+      </w:pPr>
+      <w:proofErr w:type="spellStart"/>
+      <w:r>
+        <w:rPr>
+          <w:rFonts w:ascii="Century Schoolbook" w:hAnsi="Century Schoolbook"/>
+          <w:b/>
+          <w:bCs/>
+        </w:rPr>
+        <w:t>Answer:</w:t>
+      </w:r>
+      <w:r>
+        <w:rPr>
+          <w:rFonts w:ascii="Century Schoolbook" w:hAnsi="Century Schoolbook" w:hint="eastAsia"/>
+          <w:b/>
+          <w:bCs/>
+        </w:rPr>
+        <w:t>Dropping</w:t>
+      </w:r>
+      <w:proofErr w:type="spellEnd"/>
+      <w:r>
+        <w:rPr>
+          <w:rFonts w:ascii="Century Schoolbook" w:hAnsi="Century Schoolbook" w:hint="eastAsia"/>
+          <w:b/>
+          <w:bCs/>
+        </w:rPr>
+        <w:t xml:space="preserve"> them would waste useful </w:t>
+      </w:r>
+      <w:proofErr w:type="spellStart"/>
+      <w:r>
+        <w:rPr>
+          <w:rFonts w:ascii="Century Schoolbook" w:hAnsi="Century Schoolbook" w:hint="eastAsia"/>
+          <w:b/>
+          <w:bCs/>
+        </w:rPr>
+        <w:t>text.We</w:t>
+      </w:r>
+      <w:proofErr w:type="spellEnd"/>
+      <w:r>
+        <w:rPr>
+          <w:rFonts w:ascii="Century Schoolbook" w:hAnsi="Century Schoolbook" w:hint="eastAsia"/>
+          <w:b/>
+          <w:bCs/>
+        </w:rPr>
+        <w:t xml:space="preserve"> can train a classifier to predict the missing category labels.</w:t>
+      </w:r>
+    </w:p>
+    <w:p>
+      <w:pPr>
+        <w:jc w:val="both"/>
+        <w:rPr>
+          <w:rFonts w:ascii="Century Schoolbook" w:hAnsi="Century Schoolbook" w:hint="eastAsia"/>
+        </w:rPr>
+      </w:pPr>
+      <w:r>
+        <w:rPr>
+          <w:rFonts w:ascii="Century Schoolbook" w:hAnsi="Century Schoolbook"/>
+          <w:b/>
+          <w:bCs/>
+        </w:rPr>
+        <w:t>AI used for this answer:</w:t>
+      </w:r>
+      <w:r>
+        <w:rPr>
+          <w:rFonts w:ascii="Century Schoolbook" w:hAnsi="Century Schoolbook"/>
+        </w:rPr>
+        <w:t xml:space="preserve"> Yes / No </w:t>
+      </w:r>
+      <w:proofErr w:type="spellStart"/>
+      <w:r>
+        <w:rPr>
+          <w:rFonts w:ascii="Century Schoolbook" w:hAnsi="Century Schoolbook" w:hint="eastAsia"/>
+        </w:rPr>
+        <w:t>No</w:t>
+      </w:r>
+      <w:proofErr w:type="spellEnd"/>
+    </w:p>
+    <w:p>
+      <w:pPr>
+        <w:jc w:val="both"/>
+        <w:rPr>
+          <w:rFonts w:ascii="Century Schoolbook" w:hAnsi="Century Schoolbook"/>
+        </w:rPr>
+      </w:pPr>
+      <w:r>
+        <w:rPr>
+          <w:rFonts w:ascii="Century Schoolbook" w:hAnsi="Century Schoolbook"/>
+          <w:b/>
+          <w:bCs/>
+        </w:rPr>
+        <w:t>If yes, how:</w:t>
       </w:r>
       <w:r>
         <w:rPr>
@@ -1670,183 +2022,21 @@
         </w:rPr>
         <w:t xml:space="preserve"> </w:t>
       </w:r>
-      <w:r>
-        <w:rPr>
-          <w:rFonts w:ascii="Century Schoolbook" w:hAnsi="Century Schoolbook"/>
-        </w:rPr>
-        <w:t xml:space="preserve">In Section 4.1, a dummy record with a missing value is injected and then removed using the </w:t>
-      </w:r>
-      <w:proofErr w:type="spellStart"/>
-      <w:proofErr w:type="gramStart"/>
-      <w:r>
-        <w:rPr>
-          <w:rFonts w:ascii="Century Schoolbook" w:hAnsi="Century Schoolbook"/>
-          <w:b/>
-          <w:bCs/>
-        </w:rPr>
-        <w:t>dropna</w:t>
-      </w:r>
-      <w:proofErr w:type="spellEnd"/>
-      <w:r>
-        <w:rPr>
-          <w:rFonts w:ascii="Century Schoolbook" w:hAnsi="Century Schoolbook"/>
-          <w:b/>
-          <w:bCs/>
-        </w:rPr>
-        <w:t>(</w:t>
-      </w:r>
-      <w:proofErr w:type="gramEnd"/>
-      <w:r>
-        <w:rPr>
-          <w:rFonts w:ascii="Century Schoolbook" w:hAnsi="Century Schoolbook"/>
-          <w:b/>
-          <w:bCs/>
-        </w:rPr>
-        <w:t>)</w:t>
-      </w:r>
-      <w:r>
-        <w:rPr>
-          <w:rFonts w:ascii="Century Schoolbook" w:hAnsi="Century Schoolbook"/>
-        </w:rPr>
-        <w:t xml:space="preserve"> function.</w:t>
-      </w:r>
-    </w:p>
-    <w:p>
-      <w:pPr>
-        <w:jc w:val="both"/>
-        <w:rPr>
-          <w:rFonts w:ascii="Century Schoolbook" w:hAnsi="Century Schoolbook"/>
-        </w:rPr>
-      </w:pPr>
-      <w:r>
-        <w:rPr>
-          <w:rFonts w:ascii="Century Schoolbook" w:hAnsi="Century Schoolbook"/>
-          <w:b/>
-          <w:bCs/>
-        </w:rPr>
-        <w:t>Question:</w:t>
-      </w:r>
-      <w:r>
-        <w:rPr>
-          <w:rFonts w:ascii="Century Schoolbook" w:hAnsi="Century Schoolbook"/>
-        </w:rPr>
-        <w:t xml:space="preserve"> If 40% of documents were missing the </w:t>
-      </w:r>
-      <w:proofErr w:type="spellStart"/>
-      <w:r>
-        <w:rPr>
-          <w:rFonts w:ascii="Century Schoolbook" w:hAnsi="Century Schoolbook"/>
-          <w:b/>
-          <w:bCs/>
-        </w:rPr>
-        <w:t>category_name</w:t>
-      </w:r>
-      <w:proofErr w:type="spellEnd"/>
-      <w:r>
-        <w:rPr>
-          <w:rFonts w:ascii="Century Schoolbook" w:hAnsi="Century Schoolbook"/>
-        </w:rPr>
-        <w:t xml:space="preserve"> label, why would simply dropping these rows (</w:t>
-      </w:r>
-      <w:r>
-        <w:rPr>
-          <w:rFonts w:ascii="Century Schoolbook" w:hAnsi="Century Schoolbook"/>
-        </w:rPr>
-        <w:t xml:space="preserve">with </w:t>
-      </w:r>
-      <w:proofErr w:type="spellStart"/>
-      <w:proofErr w:type="gramStart"/>
-      <w:r>
-        <w:rPr>
-          <w:rFonts w:ascii="Century Schoolbook" w:hAnsi="Century Schoolbook"/>
-          <w:b/>
-          <w:bCs/>
-        </w:rPr>
-        <w:t>dropna</w:t>
-      </w:r>
-      <w:proofErr w:type="spellEnd"/>
-      <w:r>
-        <w:rPr>
-          <w:rFonts w:ascii="Century Schoolbook" w:hAnsi="Century Schoolbook"/>
-          <w:b/>
-          <w:bCs/>
-        </w:rPr>
-        <w:t>(</w:t>
-      </w:r>
-      <w:proofErr w:type="gramEnd"/>
-      <w:r>
-        <w:rPr>
-          <w:rFonts w:ascii="Century Schoolbook" w:hAnsi="Century Schoolbook"/>
-          <w:b/>
-          <w:bCs/>
-        </w:rPr>
-        <w:t>)</w:t>
-      </w:r>
-      <w:r>
-        <w:rPr>
-          <w:rFonts w:ascii="Century Schoolbook" w:hAnsi="Century Schoolbook"/>
-        </w:rPr>
-        <w:t>)</w:t>
-      </w:r>
-      <w:r>
-        <w:rPr>
-          <w:rFonts w:ascii="Century Schoolbook" w:hAnsi="Century Schoolbook"/>
-        </w:rPr>
-        <w:t xml:space="preserve"> be a flawed data mining strategy? Name one objective alternative so the text data can still be utilized.</w:t>
-      </w:r>
-    </w:p>
-    <w:p>
-      <w:pPr>
-        <w:jc w:val="both"/>
-        <w:rPr>
-          <w:rFonts w:ascii="Century Schoolbook" w:hAnsi="Century Schoolbook"/>
-        </w:rPr>
-      </w:pPr>
-      <w:r>
-        <w:rPr>
-          <w:rFonts w:ascii="Century Schoolbook" w:hAnsi="Century Schoolbook"/>
-          <w:b/>
-          <w:bCs/>
-        </w:rPr>
-        <w:t>Answer:</w:t>
-      </w:r>
-    </w:p>
-    <w:p>
-      <w:pPr>
-        <w:jc w:val="both"/>
-        <w:rPr>
-          <w:rFonts w:ascii="Century Schoolbook" w:hAnsi="Century Schoolbook"/>
-        </w:rPr>
-      </w:pPr>
-      <w:r>
-        <w:rPr>
-          <w:rFonts w:ascii="Century Schoolbook" w:hAnsi="Century Schoolbook"/>
-          <w:b/>
-          <w:bCs/>
-        </w:rPr>
-        <w:t>AI used for this answer:</w:t>
-      </w:r>
-      <w:r>
-        <w:rPr>
-          <w:rFonts w:ascii="Century Schoolbook" w:hAnsi="Century Schoolbook"/>
-        </w:rPr>
-        <w:t xml:space="preserve"> Yes / No </w:t>
-      </w:r>
-    </w:p>
-    <w:p>
-      <w:pPr>
-        <w:jc w:val="both"/>
-        <w:rPr>
-          <w:rFonts w:ascii="Century Schoolbook" w:hAnsi="Century Schoolbook"/>
-        </w:rPr>
-      </w:pPr>
-      <w:r>
-        <w:rPr>
-          <w:rFonts w:ascii="Century Schoolbook" w:hAnsi="Century Schoolbook"/>
-          <w:b/>
-          <w:bCs/>
-        </w:rPr>
-        <w:t>If yes, how:</w:t>
+    </w:p>
+    <w:p>
+      <w:pPr>
+        <w:jc w:val="both"/>
+        <w:rPr>
+          <w:rFonts w:ascii="Century Schoolbook" w:hAnsi="Century Schoolbook" w:hint="eastAsia"/>
+        </w:rPr>
+      </w:pPr>
+      <w:r>
+        <w:rPr>
+          <w:rFonts w:ascii="Century Schoolbook" w:hAnsi="Century Schoolbook"/>
+          <w:b/>
+          <w:bCs/>
+        </w:rPr>
+        <w:t>External references (links):</w:t>
       </w:r>
       <w:r>
         <w:rPr>
@@ -1854,105 +2044,88 @@
         </w:rPr>
         <w:t xml:space="preserve"> </w:t>
       </w:r>
-    </w:p>
-    <w:p>
-      <w:pPr>
-        <w:jc w:val="both"/>
-        <w:rPr>
-          <w:rFonts w:ascii="Century Schoolbook" w:hAnsi="Century Schoolbook"/>
-        </w:rPr>
-      </w:pPr>
-      <w:r>
-        <w:rPr>
-          <w:rFonts w:ascii="Century Schoolbook" w:hAnsi="Century Schoolbook"/>
-          <w:b/>
-          <w:bCs/>
-        </w:rPr>
-        <w:t>External references (links):</w:t>
-      </w:r>
-      <w:r>
-        <w:rPr>
-          <w:rFonts w:ascii="Century Schoolbook" w:hAnsi="Century Schoolbook"/>
-        </w:rPr>
-        <w:t xml:space="preserve"> </w:t>
-      </w:r>
-    </w:p>
-    <w:p>
-      <w:pPr>
-        <w:jc w:val="both"/>
-        <w:rPr>
-          <w:rFonts w:ascii="Century Schoolbook" w:hAnsi="Century Schoolbook"/>
-        </w:rPr>
-      </w:pPr>
-    </w:p>
-    <w:p>
-      <w:pPr>
-        <w:jc w:val="both"/>
-        <w:rPr>
-          <w:rFonts w:ascii="Century Schoolbook" w:hAnsi="Century Schoolbook"/>
-        </w:rPr>
-      </w:pPr>
-    </w:p>
-    <w:p>
-      <w:pPr>
-        <w:jc w:val="both"/>
-        <w:rPr>
-          <w:rFonts w:ascii="Century Schoolbook" w:hAnsi="Century Schoolbook"/>
-        </w:rPr>
-      </w:pPr>
-    </w:p>
-    <w:p>
-      <w:pPr>
-        <w:jc w:val="both"/>
-        <w:rPr>
-          <w:rFonts w:ascii="Century Schoolbook" w:hAnsi="Century Schoolbook"/>
-        </w:rPr>
-      </w:pPr>
-    </w:p>
-    <w:p>
-      <w:pPr>
-        <w:jc w:val="both"/>
-        <w:rPr>
-          <w:rFonts w:ascii="Century Schoolbook" w:hAnsi="Century Schoolbook"/>
-        </w:rPr>
-      </w:pPr>
-    </w:p>
-    <w:p>
-      <w:pPr>
-        <w:jc w:val="both"/>
-        <w:rPr>
-          <w:rFonts w:ascii="Century Schoolbook" w:hAnsi="Century Schoolbook"/>
-        </w:rPr>
-      </w:pPr>
-    </w:p>
-    <w:p>
-      <w:pPr>
-        <w:jc w:val="both"/>
-        <w:rPr>
-          <w:rFonts w:ascii="Century Schoolbook" w:hAnsi="Century Schoolbook"/>
-        </w:rPr>
-      </w:pPr>
-    </w:p>
-    <w:p>
-      <w:pPr>
-        <w:jc w:val="both"/>
-        <w:rPr>
-          <w:rFonts w:ascii="Century Schoolbook" w:hAnsi="Century Schoolbook"/>
-        </w:rPr>
-      </w:pPr>
-    </w:p>
-    <w:p>
-      <w:pPr>
-        <w:jc w:val="both"/>
-        <w:rPr>
-          <w:rFonts w:ascii="Century Schoolbook" w:hAnsi="Century Schoolbook"/>
-        </w:rPr>
-      </w:pPr>
-      <w:r>
-        <w:rPr>
-          <w:rFonts w:ascii="Century Schoolbook" w:hAnsi="Century Schoolbook"/>
-        </w:rPr>
-        <w:lastRenderedPageBreak/>
+      <w:r>
+        <w:rPr>
+          <w:rFonts w:ascii="Century Schoolbook" w:hAnsi="Century Schoolbook" w:hint="eastAsia"/>
+        </w:rPr>
+        <w:t>none</w:t>
+      </w:r>
+    </w:p>
+    <w:p>
+      <w:pPr>
+        <w:jc w:val="both"/>
+        <w:rPr>
+          <w:rFonts w:ascii="Century Schoolbook" w:hAnsi="Century Schoolbook"/>
+        </w:rPr>
+      </w:pPr>
+    </w:p>
+    <w:p>
+      <w:pPr>
+        <w:jc w:val="both"/>
+        <w:rPr>
+          <w:rFonts w:ascii="Century Schoolbook" w:hAnsi="Century Schoolbook"/>
+        </w:rPr>
+      </w:pPr>
+    </w:p>
+    <w:p>
+      <w:pPr>
+        <w:jc w:val="both"/>
+        <w:rPr>
+          <w:rFonts w:ascii="Century Schoolbook" w:hAnsi="Century Schoolbook"/>
+        </w:rPr>
+      </w:pPr>
+    </w:p>
+    <w:p>
+      <w:pPr>
+        <w:jc w:val="both"/>
+        <w:rPr>
+          <w:rFonts w:ascii="Century Schoolbook" w:hAnsi="Century Schoolbook"/>
+        </w:rPr>
+      </w:pPr>
+    </w:p>
+    <w:p>
+      <w:pPr>
+        <w:jc w:val="both"/>
+        <w:rPr>
+          <w:rFonts w:ascii="Century Schoolbook" w:hAnsi="Century Schoolbook"/>
+        </w:rPr>
+      </w:pPr>
+    </w:p>
+    <w:p>
+      <w:pPr>
+        <w:jc w:val="both"/>
+        <w:rPr>
+          <w:rFonts w:ascii="Century Schoolbook" w:hAnsi="Century Schoolbook"/>
+        </w:rPr>
+      </w:pPr>
+    </w:p>
+    <w:p>
+      <w:pPr>
+        <w:jc w:val="both"/>
+        <w:rPr>
+          <w:rFonts w:ascii="Century Schoolbook" w:hAnsi="Century Schoolbook"/>
+        </w:rPr>
+      </w:pPr>
+    </w:p>
+    <w:p>
+      <w:pPr>
+        <w:jc w:val="both"/>
+        <w:rPr>
+          <w:rFonts w:ascii="Century Schoolbook" w:hAnsi="Century Schoolbook"/>
+        </w:rPr>
+      </w:pPr>
+    </w:p>
+    <w:p>
+      <w:pPr>
+        <w:jc w:val="both"/>
+        <w:rPr>
+          <w:rFonts w:ascii="Century Schoolbook" w:hAnsi="Century Schoolbook"/>
+        </w:rPr>
+      </w:pPr>
+      <w:r>
+        <w:rPr>
+          <w:rFonts w:ascii="Century Schoolbook" w:hAnsi="Century Schoolbook"/>
+        </w:rPr>
         <w:pict w14:anchorId="4353243F">
           <v:rect id="_x0000_i1029" style="width:0;height:1.5pt" o:hralign="center" o:hrstd="t" o:hr="t" fillcolor="#a0a0a0" stroked="f"/>
         </w:pict>
@@ -2127,6 +2300,8 @@
         <w:jc w:val="both"/>
         <w:rPr>
           <w:rFonts w:ascii="Century Schoolbook" w:hAnsi="Century Schoolbook"/>
+          <w:b/>
+          <w:bCs/>
         </w:rPr>
       </w:pPr>
       <w:r>
@@ -2147,6 +2322,85 @@
       </w:pPr>
       <w:r>
         <w:rPr>
+          <w:rFonts w:ascii="Century Schoolbook" w:hAnsi="Century Schoolbook" w:hint="eastAsia"/>
+          <w:b/>
+          <w:bCs/>
+        </w:rPr>
+        <w:t xml:space="preserve"> 1</w:t>
+      </w:r>
+      <w:r>
+        <w:rPr>
+          <w:rFonts w:ascii="Century Schoolbook" w:hAnsi="Century Schoolbook" w:hint="eastAsia"/>
+        </w:rPr>
+        <w:t xml:space="preserve">.The </w:t>
+      </w:r>
+      <w:proofErr w:type="spellStart"/>
+      <w:r>
+        <w:rPr>
+          <w:rFonts w:ascii="Century Schoolbook" w:hAnsi="Century Schoolbook" w:hint="eastAsia"/>
+        </w:rPr>
+        <w:t>porportions</w:t>
+      </w:r>
+      <w:proofErr w:type="spellEnd"/>
+      <w:r>
+        <w:rPr>
+          <w:rFonts w:ascii="Century Schoolbook" w:hAnsi="Century Schoolbook" w:hint="eastAsia"/>
+        </w:rPr>
+        <w:t xml:space="preserve"> are similar, but not exactly the same.</w:t>
+      </w:r>
+    </w:p>
+    <w:p>
+      <w:pPr>
+        <w:jc w:val="both"/>
+        <w:rPr>
+          <w:rFonts w:ascii="Century Schoolbook" w:hAnsi="Century Schoolbook" w:hint="eastAsia"/>
+          <w:b/>
+          <w:bCs/>
+        </w:rPr>
+      </w:pPr>
+      <w:r>
+        <w:rPr>
+          <w:rFonts w:ascii="Century Schoolbook" w:hAnsi="Century Schoolbook" w:hint="eastAsia"/>
+          <w:b/>
+          <w:bCs/>
+        </w:rPr>
+        <w:t>2</w:t>
+      </w:r>
+      <w:r>
+        <w:rPr>
+          <w:rFonts w:ascii="Century Schoolbook" w:hAnsi="Century Schoolbook" w:hint="eastAsia"/>
+          <w:b/>
+          <w:bCs/>
+        </w:rPr>
+        <w:t>.</w:t>
+      </w:r>
+      <w:r>
+        <w:rPr>
+          <w:rFonts w:ascii="新細明體" w:eastAsia="新細明體" w:hAnsi="新細明體" w:cs="新細明體"/>
+          <w:kern w:val="0"/>
+          <w:sz w:val="24"/>
+          <w:szCs w:val="24"/>
+          <w:lang w:bidi="th-TH"/>
+          <w14:ligatures w14:val="none"/>
+        </w:rPr>
+        <w:t xml:space="preserve"> </w:t>
+      </w:r>
+      <w:r>
+        <w:rPr>
+          <w:rFonts w:ascii="Century Schoolbook" w:hAnsi="Century Schoolbook"/>
+        </w:rPr>
+        <w:t>Minority classes may not be sampled, which can lead to biased results.</w:t>
+      </w:r>
+    </w:p>
+    <w:p>
+      <w:pPr>
+        <w:jc w:val="both"/>
+        <w:rPr>
+          <w:rFonts w:ascii="Century Schoolbook" w:hAnsi="Century Schoolbook" w:hint="eastAsia"/>
+        </w:rPr>
+      </w:pPr>
+      <w:r>
+        <w:rPr>
           <w:rFonts w:ascii="Century Schoolbook" w:hAnsi="Century Schoolbook"/>
           <w:b/>
           <w:bCs/>
@@ -2159,6 +2413,14 @@
         </w:rPr>
         <w:t xml:space="preserve"> Yes / No </w:t>
       </w:r>
+      <w:proofErr w:type="spellStart"/>
+      <w:r>
+        <w:rPr>
+          <w:rFonts w:ascii="Century Schoolbook" w:hAnsi="Century Schoolbook" w:hint="eastAsia"/>
+        </w:rPr>
+        <w:t>No</w:t>
+      </w:r>
+      <w:proofErr w:type="spellEnd"/>
     </w:p>
     <w:p>
       <w:pPr>
@@ -2186,7 +2448,7 @@
       <w:pPr>
         <w:jc w:val="both"/>
         <w:rPr>
-          <w:rFonts w:ascii="Century Schoolbook" w:hAnsi="Century Schoolbook"/>
+          <w:rFonts w:ascii="Century Schoolbook" w:hAnsi="Century Schoolbook" w:hint="eastAsia"/>
         </w:rPr>
       </w:pPr>
       <w:r>
@@ -2202,6 +2464,12 @@
           <w:rFonts w:ascii="Century Schoolbook" w:hAnsi="Century Schoolbook"/>
         </w:rPr>
         <w:t xml:space="preserve"> </w:t>
+      </w:r>
+      <w:r>
+        <w:rPr>
+          <w:rFonts w:ascii="Century Schoolbook" w:hAnsi="Century Schoolbook" w:hint="eastAsia"/>
+        </w:rPr>
+        <w:t>None</w:t>
       </w:r>
     </w:p>
     <w:p>
@@ -2479,6 +2747,8 @@
         <w:jc w:val="both"/>
         <w:rPr>
           <w:rFonts w:ascii="Century Schoolbook" w:hAnsi="Century Schoolbook"/>
+          <w:b/>
+          <w:bCs/>
         </w:rPr>
       </w:pPr>
       <w:r>
@@ -2499,6 +2769,77 @@
       </w:pPr>
       <w:r>
         <w:rPr>
+          <w:rFonts w:ascii="Century Schoolbook" w:hAnsi="Century Schoolbook" w:hint="eastAsia"/>
+        </w:rPr>
+        <w:t>1.</w:t>
+      </w:r>
+      <w:r>
+        <w:t xml:space="preserve"> </w:t>
+      </w:r>
+      <w:r>
+        <w:rPr>
+          <w:rFonts w:ascii="Century Schoolbook" w:hAnsi="Century Schoolbook"/>
+        </w:rPr>
+        <w:t xml:space="preserve">The number of features increased from 35,482 to 35,788 after adding </w:t>
+      </w:r>
+      <w:proofErr w:type="spellStart"/>
+      <w:r>
+        <w:rPr>
+          <w:rFonts w:ascii="Century Schoolbook" w:hAnsi="Century Schoolbook"/>
+        </w:rPr>
+        <w:t>stopwords</w:t>
+      </w:r>
+      <w:proofErr w:type="spellEnd"/>
+      <w:r>
+        <w:rPr>
+          <w:rFonts w:ascii="Century Schoolbook" w:hAnsi="Century Schoolbook"/>
+        </w:rPr>
+        <w:t xml:space="preserve"> back.</w:t>
+      </w:r>
+    </w:p>
+    <w:p>
+      <w:pPr>
+        <w:jc w:val="both"/>
+        <w:rPr>
+          <w:rFonts w:ascii="Century Schoolbook" w:hAnsi="Century Schoolbook" w:hint="eastAsia"/>
+        </w:rPr>
+      </w:pPr>
+      <w:r>
+        <w:rPr>
+          <w:rFonts w:ascii="Century Schoolbook" w:hAnsi="Century Schoolbook" w:hint="eastAsia"/>
+        </w:rPr>
+        <w:t xml:space="preserve">2. </w:t>
+      </w:r>
+      <w:r>
+        <w:rPr>
+          <w:rFonts w:ascii="Century Schoolbook" w:hAnsi="Century Schoolbook"/>
+        </w:rPr>
+        <w:t xml:space="preserve">The sparsity decreased from 99.68% to 99.55% because common </w:t>
+      </w:r>
+      <w:proofErr w:type="spellStart"/>
+      <w:r>
+        <w:rPr>
+          <w:rFonts w:ascii="Century Schoolbook" w:hAnsi="Century Schoolbook"/>
+        </w:rPr>
+        <w:t>stopwords</w:t>
+      </w:r>
+      <w:proofErr w:type="spellEnd"/>
+      <w:r>
+        <w:rPr>
+          <w:rFonts w:ascii="Century Schoolbook" w:hAnsi="Century Schoolbook"/>
+        </w:rPr>
+        <w:t xml:space="preserve"> appear in many documents.</w:t>
+      </w:r>
+    </w:p>
+    <w:p>
+      <w:pPr>
+        <w:jc w:val="both"/>
+        <w:rPr>
+          <w:rFonts w:ascii="Century Schoolbook" w:hAnsi="Century Schoolbook" w:hint="eastAsia"/>
+        </w:rPr>
+      </w:pPr>
+      <w:r>
+        <w:rPr>
           <w:rFonts w:ascii="Century Schoolbook" w:hAnsi="Century Schoolbook"/>
           <w:b/>
           <w:bCs/>
@@ -2511,6 +2852,12 @@
         </w:rPr>
         <w:t xml:space="preserve"> Yes / No </w:t>
       </w:r>
+      <w:r>
+        <w:rPr>
+          <w:rFonts w:ascii="Century Schoolbook" w:hAnsi="Century Schoolbook" w:hint="eastAsia"/>
+        </w:rPr>
+        <w:t xml:space="preserve"> yes</w:t>
+      </w:r>
     </w:p>
     <w:p>
       <w:pPr>
@@ -2533,6 +2880,20 @@
         </w:rPr>
         <w:t xml:space="preserve"> </w:t>
       </w:r>
+      <w:r>
+        <w:rPr>
+          <w:rFonts w:ascii="Century Schoolbook" w:hAnsi="Century Schoolbook"/>
+        </w:rPr>
+        <w:t>I used AI to learn an alternative method for comparing feature counts and matrix sparsity using Python.</w:t>
+      </w:r>
+    </w:p>
+    <w:p>
+      <w:pPr>
+        <w:jc w:val="both"/>
+        <w:rPr>
+          <w:rFonts w:ascii="Century Schoolbook" w:hAnsi="Century Schoolbook"/>
+        </w:rPr>
+      </w:pPr>
     </w:p>
     <w:p>
       <w:pPr>
@@ -2563,59 +2924,72 @@
           <w:rFonts w:ascii="Century Schoolbook" w:hAnsi="Century Schoolbook"/>
         </w:rPr>
       </w:pPr>
-    </w:p>
-    <w:p>
-      <w:pPr>
-        <w:jc w:val="both"/>
-        <w:rPr>
-          <w:rFonts w:ascii="Century Schoolbook" w:hAnsi="Century Schoolbook"/>
-        </w:rPr>
-      </w:pPr>
-    </w:p>
-    <w:p>
-      <w:pPr>
-        <w:jc w:val="both"/>
-        <w:rPr>
-          <w:rFonts w:ascii="Century Schoolbook" w:hAnsi="Century Schoolbook"/>
-        </w:rPr>
-      </w:pPr>
-    </w:p>
-    <w:p>
-      <w:pPr>
-        <w:jc w:val="both"/>
-        <w:rPr>
-          <w:rFonts w:ascii="Century Schoolbook" w:hAnsi="Century Schoolbook"/>
-        </w:rPr>
-      </w:pPr>
-    </w:p>
-    <w:p>
-      <w:pPr>
-        <w:jc w:val="both"/>
-        <w:rPr>
-          <w:rFonts w:ascii="Century Schoolbook" w:hAnsi="Century Schoolbook"/>
-        </w:rPr>
-      </w:pPr>
-    </w:p>
-    <w:p>
-      <w:pPr>
-        <w:jc w:val="both"/>
-        <w:rPr>
-          <w:rFonts w:ascii="Century Schoolbook" w:hAnsi="Century Schoolbook"/>
-        </w:rPr>
-      </w:pPr>
-    </w:p>
-    <w:p>
-      <w:pPr>
-        <w:jc w:val="both"/>
-        <w:rPr>
-          <w:rFonts w:ascii="Century Schoolbook" w:hAnsi="Century Schoolbook"/>
-        </w:rPr>
-      </w:pPr>
-      <w:r>
-        <w:rPr>
-          <w:rFonts w:ascii="Century Schoolbook" w:hAnsi="Century Schoolbook"/>
-        </w:rPr>
-        <w:lastRenderedPageBreak/>
+      <w:r>
+        <w:rPr>
+          <w:rFonts w:ascii="Century Schoolbook" w:hAnsi="Century Schoolbook"/>
+        </w:rPr>
+        <w:t>https://scikit-learn.org/stable/modules/generated/sklearn.feature_extraction.text.CountVectorizer.html</w:t>
+      </w:r>
+    </w:p>
+    <w:p>
+      <w:pPr>
+        <w:jc w:val="both"/>
+        <w:rPr>
+          <w:rFonts w:ascii="Century Schoolbook" w:hAnsi="Century Schoolbook"/>
+        </w:rPr>
+      </w:pPr>
+    </w:p>
+    <w:p>
+      <w:pPr>
+        <w:jc w:val="both"/>
+        <w:rPr>
+          <w:rFonts w:ascii="Century Schoolbook" w:hAnsi="Century Schoolbook"/>
+        </w:rPr>
+      </w:pPr>
+    </w:p>
+    <w:p>
+      <w:pPr>
+        <w:jc w:val="both"/>
+        <w:rPr>
+          <w:rFonts w:ascii="Century Schoolbook" w:hAnsi="Century Schoolbook"/>
+        </w:rPr>
+      </w:pPr>
+    </w:p>
+    <w:p>
+      <w:pPr>
+        <w:jc w:val="both"/>
+        <w:rPr>
+          <w:rFonts w:ascii="Century Schoolbook" w:hAnsi="Century Schoolbook"/>
+        </w:rPr>
+      </w:pPr>
+    </w:p>
+    <w:p>
+      <w:pPr>
+        <w:jc w:val="both"/>
+        <w:rPr>
+          <w:rFonts w:ascii="Century Schoolbook" w:hAnsi="Century Schoolbook"/>
+        </w:rPr>
+      </w:pPr>
+    </w:p>
+    <w:p>
+      <w:pPr>
+        <w:jc w:val="both"/>
+        <w:rPr>
+          <w:rFonts w:ascii="Century Schoolbook" w:hAnsi="Century Schoolbook"/>
+        </w:rPr>
+      </w:pPr>
+    </w:p>
+    <w:p>
+      <w:pPr>
+        <w:jc w:val="both"/>
+        <w:rPr>
+          <w:rFonts w:ascii="Century Schoolbook" w:hAnsi="Century Schoolbook"/>
+        </w:rPr>
+      </w:pPr>
+      <w:r>
+        <w:rPr>
+          <w:rFonts w:ascii="Century Schoolbook" w:hAnsi="Century Schoolbook"/>
+        </w:rPr>
         <w:pict w14:anchorId="5994C8B3">
           <v:rect id="_x0000_i1031" style="width:0;height:1.5pt" o:hralign="center" o:hrstd="t" o:hr="t" fillcolor="#a0a0a0" stroked="f"/>
         </w:pict>
@@ -2835,6 +3209,8 @@
         <w:jc w:val="both"/>
         <w:rPr>
           <w:rFonts w:ascii="Century Schoolbook" w:hAnsi="Century Schoolbook"/>
+          <w:b/>
+          <w:bCs/>
         </w:rPr>
       </w:pPr>
       <w:r>
@@ -2845,6 +3221,135 @@
         </w:rPr>
         <w:t>Answer:</w:t>
       </w:r>
+    </w:p>
+    <w:p>
+      <w:pPr>
+        <w:jc w:val="both"/>
+        <w:rPr>
+          <w:rFonts w:ascii="Century Schoolbook" w:hAnsi="Century Schoolbook"/>
+          <w:b/>
+          <w:bCs/>
+        </w:rPr>
+      </w:pPr>
+      <w:r>
+        <w:rPr>
+          <w:rFonts w:ascii="Century Schoolbook" w:hAnsi="Century Schoolbook" w:hint="eastAsia"/>
+          <w:b/>
+          <w:bCs/>
+        </w:rPr>
+        <w:t>1.</w:t>
+      </w:r>
+      <w:r>
+        <w:rPr>
+          <w:rFonts w:ascii="新細明體" w:eastAsia="新細明體" w:hAnsi="新細明體" w:cs="新細明體"/>
+          <w:kern w:val="0"/>
+          <w:sz w:val="24"/>
+          <w:szCs w:val="24"/>
+          <w:lang w:bidi="th-TH"/>
+          <w14:ligatures w14:val="none"/>
+        </w:rPr>
+        <w:t xml:space="preserve"> </w:t>
+      </w:r>
+      <w:r>
+        <w:rPr>
+          <w:rFonts w:ascii="Century Schoolbook" w:hAnsi="Century Schoolbook"/>
+          <w:b/>
+          <w:bCs/>
+        </w:rPr>
+        <w:t>As the variance threshold increases, the vocabulary size decreases from 35,482 to 1,710.</w:t>
+      </w:r>
+    </w:p>
+    <w:p>
+      <w:pPr>
+        <w:jc w:val="both"/>
+        <w:rPr>
+          <w:rFonts w:ascii="Century Schoolbook" w:hAnsi="Century Schoolbook"/>
+          <w:b/>
+          <w:bCs/>
+        </w:rPr>
+      </w:pPr>
+      <w:r>
+        <w:rPr>
+          <w:rFonts w:ascii="Century Schoolbook" w:hAnsi="Century Schoolbook" w:hint="eastAsia"/>
+          <w:b/>
+          <w:bCs/>
+        </w:rPr>
+        <w:t>2.</w:t>
+      </w:r>
+      <w:r>
+        <w:rPr>
+          <w:rFonts w:ascii="新細明體" w:eastAsia="新細明體" w:hAnsi="新細明體" w:cs="新細明體"/>
+          <w:kern w:val="0"/>
+          <w:sz w:val="24"/>
+          <w:szCs w:val="24"/>
+          <w:lang w:bidi="th-TH"/>
+          <w14:ligatures w14:val="none"/>
+        </w:rPr>
+        <w:t xml:space="preserve"> </w:t>
+      </w:r>
+      <w:r>
+        <w:rPr>
+          <w:rFonts w:ascii="Century Schoolbook" w:hAnsi="Century Schoolbook"/>
+          <w:b/>
+          <w:bCs/>
+        </w:rPr>
+        <w:t>Words that appear very rarely or have nearly constant frequencies across documents are removed first.</w:t>
+      </w:r>
+    </w:p>
+    <w:p>
+      <w:pPr>
+        <w:jc w:val="both"/>
+        <w:rPr>
+          <w:rFonts w:ascii="Century Schoolbook" w:hAnsi="Century Schoolbook"/>
+          <w:b/>
+          <w:bCs/>
+        </w:rPr>
+      </w:pPr>
+      <w:r>
+        <w:rPr>
+          <w:rFonts w:ascii="Century Schoolbook" w:hAnsi="Century Schoolbook" w:hint="eastAsia"/>
+          <w:b/>
+          <w:bCs/>
+        </w:rPr>
+        <w:t>3.</w:t>
+      </w:r>
+      <w:r>
+        <w:rPr>
+          <w:rFonts w:ascii="新細明體" w:eastAsia="新細明體" w:hAnsi="新細明體" w:cs="新細明體"/>
+          <w:kern w:val="0"/>
+          <w:sz w:val="24"/>
+          <w:szCs w:val="24"/>
+          <w:lang w:bidi="th-TH"/>
+          <w14:ligatures w14:val="none"/>
+        </w:rPr>
+        <w:t xml:space="preserve"> </w:t>
+      </w:r>
+      <w:r>
+        <w:rPr>
+          <w:rFonts w:ascii="Century Schoolbook" w:hAnsi="Century Schoolbook"/>
+          <w:b/>
+          <w:bCs/>
+        </w:rPr>
+        <w:t>Low-variance features usually provide little information for distinguishing documents. Removing them reduces dimensionality while preserving most useful features.</w:t>
+      </w:r>
+    </w:p>
+    <w:p>
+      <w:pPr>
+        <w:jc w:val="both"/>
+        <w:rPr>
+          <w:rFonts w:ascii="Century Schoolbook" w:hAnsi="Century Schoolbook" w:hint="eastAsia"/>
+          <w:b/>
+          <w:bCs/>
+        </w:rPr>
+      </w:pPr>
+    </w:p>
+    <w:p>
+      <w:pPr>
+        <w:jc w:val="both"/>
+        <w:rPr>
+          <w:rFonts w:ascii="Century Schoolbook" w:hAnsi="Century Schoolbook" w:hint="eastAsia"/>
+        </w:rPr>
+      </w:pPr>
     </w:p>
     <w:tbl>
       <w:tblPr>
@@ -2932,7 +3437,7 @@
             <w:pPr>
               <w:jc w:val="both"/>
               <w:rPr>
-                <w:rFonts w:ascii="Century Schoolbook" w:hAnsi="Century Schoolbook"/>
+                <w:rFonts w:ascii="Century Schoolbook" w:hAnsi="Century Schoolbook" w:hint="eastAsia"/>
               </w:rPr>
             </w:pPr>
             <w:r>
@@ -2940,6 +3445,12 @@
                 <w:rFonts w:ascii="Century Schoolbook" w:hAnsi="Century Schoolbook"/>
               </w:rPr>
               <w:t>0.0</w:t>
+            </w:r>
+            <w:r>
+              <w:rPr>
+                <w:rFonts w:ascii="Century Schoolbook" w:hAnsi="Century Schoolbook" w:hint="eastAsia"/>
+              </w:rPr>
+              <w:t xml:space="preserve">                                  </w:t>
             </w:r>
           </w:p>
         </w:tc>
@@ -2953,9 +3464,15 @@
             <w:pPr>
               <w:jc w:val="both"/>
               <w:rPr>
-                <w:rFonts w:ascii="Century Schoolbook" w:hAnsi="Century Schoolbook"/>
+                <w:rFonts w:ascii="Century Schoolbook" w:hAnsi="Century Schoolbook" w:hint="eastAsia"/>
               </w:rPr>
             </w:pPr>
+            <w:r>
+              <w:rPr>
+                <w:rFonts w:ascii="Century Schoolbook" w:hAnsi="Century Schoolbook" w:hint="eastAsia"/>
+              </w:rPr>
+              <w:t>35482</w:t>
+            </w:r>
           </w:p>
         </w:tc>
       </w:tr>
@@ -2980,6 +3497,7 @@
               <w:rPr>
                 <w:rFonts w:ascii="Century Schoolbook" w:hAnsi="Century Schoolbook"/>
               </w:rPr>
+              <w:lastRenderedPageBreak/>
               <w:t>0.01</w:t>
             </w:r>
           </w:p>
@@ -2994,9 +3512,15 @@
             <w:pPr>
               <w:jc w:val="both"/>
               <w:rPr>
-                <w:rFonts w:ascii="Century Schoolbook" w:hAnsi="Century Schoolbook"/>
+                <w:rFonts w:ascii="Century Schoolbook" w:hAnsi="Century Schoolbook" w:hint="eastAsia"/>
               </w:rPr>
             </w:pPr>
+            <w:r>
+              <w:rPr>
+                <w:rFonts w:ascii="Century Schoolbook" w:hAnsi="Century Schoolbook" w:hint="eastAsia"/>
+              </w:rPr>
+              <w:t>5089</w:t>
+            </w:r>
           </w:p>
         </w:tc>
       </w:tr>
@@ -3035,9 +3559,15 @@
             <w:pPr>
               <w:jc w:val="both"/>
               <w:rPr>
-                <w:rFonts w:ascii="Century Schoolbook" w:hAnsi="Century Schoolbook"/>
+                <w:rFonts w:ascii="Century Schoolbook" w:hAnsi="Century Schoolbook" w:hint="eastAsia"/>
               </w:rPr>
             </w:pPr>
+            <w:r>
+              <w:rPr>
+                <w:rFonts w:ascii="Century Schoolbook" w:hAnsi="Century Schoolbook" w:hint="eastAsia"/>
+              </w:rPr>
+              <w:t>1710</w:t>
+            </w:r>
           </w:p>
         </w:tc>
       </w:tr>
@@ -3046,7 +3576,7 @@
       <w:pPr>
         <w:jc w:val="both"/>
         <w:rPr>
-          <w:rFonts w:ascii="Century Schoolbook" w:hAnsi="Century Schoolbook"/>
+          <w:rFonts w:ascii="Century Schoolbook" w:hAnsi="Century Schoolbook" w:hint="eastAsia"/>
         </w:rPr>
       </w:pPr>
       <w:r>
@@ -3063,6 +3593,14 @@
         </w:rPr>
         <w:t xml:space="preserve"> Yes / No </w:t>
       </w:r>
+      <w:proofErr w:type="spellStart"/>
+      <w:r>
+        <w:rPr>
+          <w:rFonts w:ascii="Century Schoolbook" w:hAnsi="Century Schoolbook" w:hint="eastAsia"/>
+        </w:rPr>
+        <w:t>No</w:t>
+      </w:r>
+      <w:proofErr w:type="spellEnd"/>
     </w:p>
     <w:p>
       <w:pPr>
@@ -3090,7 +3628,7 @@
       <w:pPr>
         <w:jc w:val="both"/>
         <w:rPr>
-          <w:rFonts w:ascii="Century Schoolbook" w:hAnsi="Century Schoolbook"/>
+          <w:rFonts w:ascii="Century Schoolbook" w:hAnsi="Century Schoolbook" w:hint="eastAsia"/>
         </w:rPr>
       </w:pPr>
       <w:r>
@@ -3107,123 +3645,128 @@
         </w:rPr>
         <w:t xml:space="preserve"> </w:t>
       </w:r>
-    </w:p>
-    <w:p>
-      <w:pPr>
-        <w:jc w:val="both"/>
-        <w:rPr>
-          <w:rFonts w:ascii="Century Schoolbook" w:hAnsi="Century Schoolbook"/>
-        </w:rPr>
-      </w:pPr>
-    </w:p>
-    <w:p>
-      <w:pPr>
-        <w:jc w:val="both"/>
-        <w:rPr>
-          <w:rFonts w:ascii="Century Schoolbook" w:hAnsi="Century Schoolbook"/>
-        </w:rPr>
-      </w:pPr>
-    </w:p>
-    <w:p>
-      <w:pPr>
-        <w:jc w:val="both"/>
-        <w:rPr>
-          <w:rFonts w:ascii="Century Schoolbook" w:hAnsi="Century Schoolbook"/>
-        </w:rPr>
-      </w:pPr>
-    </w:p>
-    <w:p>
-      <w:pPr>
-        <w:jc w:val="both"/>
-        <w:rPr>
-          <w:rFonts w:ascii="Century Schoolbook" w:hAnsi="Century Schoolbook"/>
-        </w:rPr>
-      </w:pPr>
-    </w:p>
-    <w:p>
-      <w:pPr>
-        <w:jc w:val="both"/>
-        <w:rPr>
-          <w:rFonts w:ascii="Century Schoolbook" w:hAnsi="Century Schoolbook"/>
-        </w:rPr>
-      </w:pPr>
-    </w:p>
-    <w:p>
-      <w:pPr>
-        <w:jc w:val="both"/>
-        <w:rPr>
-          <w:rFonts w:ascii="Century Schoolbook" w:hAnsi="Century Schoolbook"/>
-        </w:rPr>
-      </w:pPr>
-    </w:p>
-    <w:p>
-      <w:pPr>
-        <w:jc w:val="both"/>
-        <w:rPr>
-          <w:rFonts w:ascii="Century Schoolbook" w:hAnsi="Century Schoolbook"/>
-        </w:rPr>
-      </w:pPr>
-    </w:p>
-    <w:p>
-      <w:pPr>
-        <w:jc w:val="both"/>
-        <w:rPr>
-          <w:rFonts w:ascii="Century Schoolbook" w:hAnsi="Century Schoolbook"/>
-        </w:rPr>
-      </w:pPr>
-    </w:p>
-    <w:p>
-      <w:pPr>
-        <w:jc w:val="both"/>
-        <w:rPr>
-          <w:rFonts w:ascii="Century Schoolbook" w:hAnsi="Century Schoolbook"/>
-        </w:rPr>
-      </w:pPr>
-    </w:p>
-    <w:p>
-      <w:pPr>
-        <w:jc w:val="both"/>
-        <w:rPr>
-          <w:rFonts w:ascii="Century Schoolbook" w:hAnsi="Century Schoolbook"/>
-        </w:rPr>
-      </w:pPr>
-    </w:p>
-    <w:p>
-      <w:pPr>
-        <w:jc w:val="both"/>
-        <w:rPr>
-          <w:rFonts w:ascii="Century Schoolbook" w:hAnsi="Century Schoolbook"/>
-        </w:rPr>
-      </w:pPr>
-    </w:p>
-    <w:p>
-      <w:pPr>
-        <w:jc w:val="both"/>
-        <w:rPr>
-          <w:rFonts w:ascii="Century Schoolbook" w:hAnsi="Century Schoolbook"/>
-        </w:rPr>
-      </w:pPr>
-    </w:p>
-    <w:p>
-      <w:pPr>
-        <w:jc w:val="both"/>
-        <w:rPr>
-          <w:rFonts w:ascii="Century Schoolbook" w:hAnsi="Century Schoolbook"/>
-        </w:rPr>
-      </w:pPr>
-    </w:p>
-    <w:p>
-      <w:pPr>
-        <w:jc w:val="both"/>
-        <w:rPr>
-          <w:rFonts w:ascii="Century Schoolbook" w:hAnsi="Century Schoolbook"/>
-        </w:rPr>
-      </w:pPr>
-      <w:r>
-        <w:rPr>
-          <w:rFonts w:ascii="Century Schoolbook" w:hAnsi="Century Schoolbook"/>
-        </w:rPr>
-        <w:lastRenderedPageBreak/>
+      <w:r>
+        <w:rPr>
+          <w:rFonts w:ascii="Century Schoolbook" w:hAnsi="Century Schoolbook" w:hint="eastAsia"/>
+        </w:rPr>
+        <w:t>None</w:t>
+      </w:r>
+    </w:p>
+    <w:p>
+      <w:pPr>
+        <w:jc w:val="both"/>
+        <w:rPr>
+          <w:rFonts w:ascii="Century Schoolbook" w:hAnsi="Century Schoolbook"/>
+        </w:rPr>
+      </w:pPr>
+    </w:p>
+    <w:p>
+      <w:pPr>
+        <w:jc w:val="both"/>
+        <w:rPr>
+          <w:rFonts w:ascii="Century Schoolbook" w:hAnsi="Century Schoolbook"/>
+        </w:rPr>
+      </w:pPr>
+    </w:p>
+    <w:p>
+      <w:pPr>
+        <w:jc w:val="both"/>
+        <w:rPr>
+          <w:rFonts w:ascii="Century Schoolbook" w:hAnsi="Century Schoolbook"/>
+        </w:rPr>
+      </w:pPr>
+    </w:p>
+    <w:p>
+      <w:pPr>
+        <w:jc w:val="both"/>
+        <w:rPr>
+          <w:rFonts w:ascii="Century Schoolbook" w:hAnsi="Century Schoolbook"/>
+        </w:rPr>
+      </w:pPr>
+    </w:p>
+    <w:p>
+      <w:pPr>
+        <w:jc w:val="both"/>
+        <w:rPr>
+          <w:rFonts w:ascii="Century Schoolbook" w:hAnsi="Century Schoolbook"/>
+        </w:rPr>
+      </w:pPr>
+    </w:p>
+    <w:p>
+      <w:pPr>
+        <w:jc w:val="both"/>
+        <w:rPr>
+          <w:rFonts w:ascii="Century Schoolbook" w:hAnsi="Century Schoolbook"/>
+        </w:rPr>
+      </w:pPr>
+    </w:p>
+    <w:p>
+      <w:pPr>
+        <w:jc w:val="both"/>
+        <w:rPr>
+          <w:rFonts w:ascii="Century Schoolbook" w:hAnsi="Century Schoolbook"/>
+        </w:rPr>
+      </w:pPr>
+    </w:p>
+    <w:p>
+      <w:pPr>
+        <w:jc w:val="both"/>
+        <w:rPr>
+          <w:rFonts w:ascii="Century Schoolbook" w:hAnsi="Century Schoolbook"/>
+        </w:rPr>
+      </w:pPr>
+    </w:p>
+    <w:p>
+      <w:pPr>
+        <w:jc w:val="both"/>
+        <w:rPr>
+          <w:rFonts w:ascii="Century Schoolbook" w:hAnsi="Century Schoolbook"/>
+        </w:rPr>
+      </w:pPr>
+    </w:p>
+    <w:p>
+      <w:pPr>
+        <w:jc w:val="both"/>
+        <w:rPr>
+          <w:rFonts w:ascii="Century Schoolbook" w:hAnsi="Century Schoolbook"/>
+        </w:rPr>
+      </w:pPr>
+    </w:p>
+    <w:p>
+      <w:pPr>
+        <w:jc w:val="both"/>
+        <w:rPr>
+          <w:rFonts w:ascii="Century Schoolbook" w:hAnsi="Century Schoolbook"/>
+        </w:rPr>
+      </w:pPr>
+    </w:p>
+    <w:p>
+      <w:pPr>
+        <w:jc w:val="both"/>
+        <w:rPr>
+          <w:rFonts w:ascii="Century Schoolbook" w:hAnsi="Century Schoolbook"/>
+        </w:rPr>
+      </w:pPr>
+    </w:p>
+    <w:p>
+      <w:pPr>
+        <w:jc w:val="both"/>
+        <w:rPr>
+          <w:rFonts w:ascii="Century Schoolbook" w:hAnsi="Century Schoolbook"/>
+        </w:rPr>
+      </w:pPr>
+    </w:p>
+    <w:p>
+      <w:pPr>
+        <w:jc w:val="both"/>
+        <w:rPr>
+          <w:rFonts w:ascii="Century Schoolbook" w:hAnsi="Century Schoolbook"/>
+        </w:rPr>
+      </w:pPr>
+      <w:r>
+        <w:rPr>
+          <w:rFonts w:ascii="Century Schoolbook" w:hAnsi="Century Schoolbook"/>
+        </w:rPr>
         <w:pict w14:anchorId="3BE467AD">
           <v:rect id="_x0000_i1032" style="width:0;height:1.5pt" o:hralign="center" o:hrstd="t" o:hr="t" fillcolor="#a0a0a0" stroked="f"/>
         </w:pict>
@@ -3305,7 +3848,6 @@
         <w:t xml:space="preserve">Run the correlation filter against the binary indicator for the </w:t>
       </w:r>
       <w:proofErr w:type="spellStart"/>
-      <w:proofErr w:type="gramStart"/>
       <w:r>
         <w:rPr>
           <w:rFonts w:ascii="Century Schoolbook" w:hAnsi="Century Schoolbook"/>
@@ -3315,7 +3857,6 @@
         <w:t>comp.graphics</w:t>
       </w:r>
       <w:proofErr w:type="spellEnd"/>
-      <w:proofErr w:type="gramEnd"/>
       <w:r>
         <w:rPr>
           <w:rFonts w:ascii="Century Schoolbook" w:hAnsi="Century Schoolbook"/>
@@ -3373,7 +3914,7 @@
     </w:p>
     <w:p>
       <w:pPr>
-        <w:pStyle w:val="ListParagraph"/>
+        <w:pStyle w:val="a9"/>
         <w:numPr>
           <w:ilvl w:val="1"/>
           <w:numId w:val="7"/>
@@ -3392,7 +3933,7 @@
     </w:p>
     <w:p>
       <w:pPr>
-        <w:pStyle w:val="ListParagraph"/>
+        <w:pStyle w:val="a9"/>
         <w:numPr>
           <w:ilvl w:val="1"/>
           <w:numId w:val="7"/>
@@ -3439,7 +3980,7 @@
     </w:p>
     <w:p>
       <w:pPr>
-        <w:pStyle w:val="ListParagraph"/>
+        <w:pStyle w:val="a9"/>
         <w:numPr>
           <w:ilvl w:val="1"/>
           <w:numId w:val="7"/>
@@ -3489,6 +4030,8 @@
         <w:jc w:val="both"/>
         <w:rPr>
           <w:rFonts w:ascii="Century Schoolbook" w:hAnsi="Century Schoolbook"/>
+          <w:b/>
+          <w:bCs/>
         </w:rPr>
       </w:pPr>
       <w:r>
@@ -3505,6 +4048,132 @@
         <w:jc w:val="both"/>
         <w:rPr>
           <w:rFonts w:ascii="Century Schoolbook" w:hAnsi="Century Schoolbook"/>
+          <w:b/>
+          <w:bCs/>
+        </w:rPr>
+      </w:pPr>
+      <w:r>
+        <w:rPr>
+          <w:rFonts w:ascii="Century Schoolbook" w:hAnsi="Century Schoolbook" w:hint="eastAsia"/>
+          <w:b/>
+          <w:bCs/>
+        </w:rPr>
+        <w:lastRenderedPageBreak/>
+        <w:t>1.</w:t>
+      </w:r>
+      <w:r>
+        <w:rPr>
+          <w:rFonts w:ascii="新細明體" w:eastAsia="新細明體" w:hAnsi="新細明體" w:cs="新細明體"/>
+          <w:kern w:val="0"/>
+          <w:sz w:val="24"/>
+          <w:szCs w:val="24"/>
+          <w:lang w:bidi="th-TH"/>
+          <w14:ligatures w14:val="none"/>
+        </w:rPr>
+        <w:t xml:space="preserve"> </w:t>
+      </w:r>
+      <w:r>
+        <w:rPr>
+          <w:rFonts w:ascii="Century Schoolbook" w:hAnsi="Century Schoolbook"/>
+          <w:b/>
+          <w:bCs/>
+        </w:rPr>
+        <w:t>The top words include both common words and graphics-related terms. Pearson finds words like "</w:t>
+      </w:r>
+      <w:proofErr w:type="spellStart"/>
+      <w:r>
+        <w:rPr>
+          <w:rFonts w:ascii="Century Schoolbook" w:hAnsi="Century Schoolbook"/>
+          <w:b/>
+          <w:bCs/>
+        </w:rPr>
+        <w:t>vga</w:t>
+      </w:r>
+      <w:proofErr w:type="spellEnd"/>
+      <w:r>
+        <w:rPr>
+          <w:rFonts w:ascii="Century Schoolbook" w:hAnsi="Century Schoolbook"/>
+          <w:b/>
+          <w:bCs/>
+        </w:rPr>
+        <w:t>", "video", and "keywords", while Spearman finds "graphics" and "files". Some common words also have high correlations.</w:t>
+      </w:r>
+    </w:p>
+    <w:p>
+      <w:pPr>
+        <w:jc w:val="both"/>
+        <w:rPr>
+          <w:rFonts w:ascii="Century Schoolbook" w:hAnsi="Century Schoolbook"/>
+          <w:b/>
+          <w:bCs/>
+        </w:rPr>
+      </w:pPr>
+      <w:r>
+        <w:rPr>
+          <w:rFonts w:ascii="Century Schoolbook" w:hAnsi="Century Schoolbook" w:hint="eastAsia"/>
+          <w:b/>
+          <w:bCs/>
+        </w:rPr>
+        <w:t xml:space="preserve">2. </w:t>
+      </w:r>
+      <w:r>
+        <w:rPr>
+          <w:rFonts w:ascii="Century Schoolbook" w:hAnsi="Century Schoolbook"/>
+          <w:b/>
+          <w:bCs/>
+        </w:rPr>
+        <w:t>Pearson measures linear relationships using original values, while Spearman measures monotonic relationships using ranks. Spearman is usually less sensitive to extreme values.</w:t>
+      </w:r>
+    </w:p>
+    <w:p>
+      <w:pPr>
+        <w:jc w:val="both"/>
+        <w:rPr>
+          <w:rFonts w:ascii="Century Schoolbook" w:hAnsi="Century Schoolbook"/>
+          <w:b/>
+          <w:bCs/>
+        </w:rPr>
+      </w:pPr>
+      <w:r>
+        <w:rPr>
+          <w:rFonts w:ascii="Century Schoolbook" w:hAnsi="Century Schoolbook" w:hint="eastAsia"/>
+          <w:b/>
+          <w:bCs/>
+        </w:rPr>
+        <w:t xml:space="preserve">3. </w:t>
+      </w:r>
+      <w:r>
+        <w:rPr>
+          <w:rFonts w:ascii="Century Schoolbook" w:hAnsi="Century Schoolbook"/>
+          <w:b/>
+          <w:bCs/>
+        </w:rPr>
+        <w:t>This can happen when a word appears more frequently in graphics-related documents, but a few documents have extremely high word counts. These extreme values can affect Pearson more than Spearman.</w:t>
+      </w:r>
+    </w:p>
+    <w:p>
+      <w:pPr>
+        <w:jc w:val="both"/>
+        <w:rPr>
+          <w:rFonts w:ascii="Century Schoolbook" w:hAnsi="Century Schoolbook" w:hint="eastAsia"/>
+          <w:b/>
+          <w:bCs/>
+        </w:rPr>
+      </w:pPr>
+    </w:p>
+    <w:p>
+      <w:pPr>
+        <w:jc w:val="both"/>
+        <w:rPr>
+          <w:rFonts w:ascii="Century Schoolbook" w:hAnsi="Century Schoolbook" w:hint="eastAsia"/>
+        </w:rPr>
+      </w:pPr>
+    </w:p>
+    <w:p>
+      <w:pPr>
+        <w:jc w:val="both"/>
+        <w:rPr>
+          <w:rFonts w:ascii="Century Schoolbook" w:hAnsi="Century Schoolbook"/>
         </w:rPr>
       </w:pPr>
       <w:r>
@@ -3519,7 +4188,7 @@
         <w:rPr>
           <w:rFonts w:ascii="Century Schoolbook" w:hAnsi="Century Schoolbook"/>
         </w:rPr>
-        <w:t xml:space="preserve"> Yes / No </w:t>
+        <w:t xml:space="preserve"> Yes </w:t>
       </w:r>
     </w:p>
     <w:p>
@@ -3543,6 +4212,20 @@
         </w:rPr>
         <w:t xml:space="preserve"> </w:t>
       </w:r>
+      <w:r>
+        <w:rPr>
+          <w:rFonts w:ascii="Century Schoolbook" w:hAnsi="Century Schoolbook"/>
+        </w:rPr>
+        <w:t>I used ChatGPT to understand Pearson and Spearman correlation, interpret my experimental results, and improve my English answers.</w:t>
+      </w:r>
+    </w:p>
+    <w:p>
+      <w:pPr>
+        <w:jc w:val="both"/>
+        <w:rPr>
+          <w:rFonts w:ascii="Century Schoolbook" w:hAnsi="Century Schoolbook"/>
+        </w:rPr>
+      </w:pPr>
     </w:p>
     <w:p>
       <w:pPr>
@@ -3657,23 +4340,13 @@
         </w:rPr>
         <w:t xml:space="preserve">In the Frequent Pattern Mining section, run </w:t>
       </w:r>
-      <w:proofErr w:type="gramStart"/>
-      <w:r>
-        <w:rPr>
-          <w:rFonts w:ascii="Century Schoolbook" w:hAnsi="Century Schoolbook"/>
-          <w:b/>
-          <w:bCs/>
-        </w:rPr>
-        <w:t>Top-K</w:t>
-      </w:r>
-      <w:proofErr w:type="gramEnd"/>
-      <w:r>
-        <w:rPr>
-          <w:rFonts w:ascii="Century Schoolbook" w:hAnsi="Century Schoolbook"/>
-          <w:b/>
-          <w:bCs/>
-        </w:rPr>
-        <w:t xml:space="preserve"> FAE</w:t>
+      <w:r>
+        <w:rPr>
+          <w:rFonts w:ascii="Century Schoolbook" w:hAnsi="Century Schoolbook"/>
+          <w:b/>
+          <w:bCs/>
+        </w:rPr>
+        <w:t>Top-K FAE</w:t>
       </w:r>
       <w:r>
         <w:rPr>
@@ -3841,23 +4514,13 @@
         </w:rPr>
         <w:t xml:space="preserve">How does the parameter k in </w:t>
       </w:r>
-      <w:proofErr w:type="gramStart"/>
-      <w:r>
-        <w:rPr>
-          <w:rFonts w:ascii="Century Schoolbook" w:hAnsi="Century Schoolbook"/>
-          <w:b/>
-          <w:bCs/>
-        </w:rPr>
-        <w:t>Top-K</w:t>
-      </w:r>
-      <w:proofErr w:type="gramEnd"/>
-      <w:r>
-        <w:rPr>
-          <w:rFonts w:ascii="Century Schoolbook" w:hAnsi="Century Schoolbook"/>
-          <w:b/>
-          <w:bCs/>
-        </w:rPr>
-        <w:t xml:space="preserve"> FAE</w:t>
+      <w:r>
+        <w:rPr>
+          <w:rFonts w:ascii="Century Schoolbook" w:hAnsi="Century Schoolbook"/>
+          <w:b/>
+          <w:bCs/>
+        </w:rPr>
+        <w:t>Top-K FAE</w:t>
       </w:r>
       <w:r>
         <w:rPr>
@@ -3921,34 +4584,16 @@
       <w:pPr>
         <w:jc w:val="both"/>
         <w:rPr>
-          <w:rFonts w:ascii="Century Schoolbook" w:hAnsi="Century Schoolbook"/>
-        </w:rPr>
-      </w:pPr>
-      <w:r>
-        <w:rPr>
-          <w:rFonts w:ascii="Century Schoolbook" w:hAnsi="Century Schoolbook"/>
-          <w:b/>
-          <w:bCs/>
-        </w:rPr>
-        <w:t>Answer (</w:t>
-      </w:r>
-      <w:proofErr w:type="gramStart"/>
-      <w:r>
-        <w:rPr>
-          <w:rFonts w:ascii="Century Schoolbook" w:hAnsi="Century Schoolbook"/>
-          <w:b/>
-          <w:bCs/>
-        </w:rPr>
-        <w:t>1) —</w:t>
-      </w:r>
-      <w:proofErr w:type="gramEnd"/>
-      <w:r>
-        <w:rPr>
-          <w:rFonts w:ascii="Century Schoolbook" w:hAnsi="Century Schoolbook"/>
-          <w:b/>
-          <w:bCs/>
-        </w:rPr>
-        <w:t xml:space="preserve"> Runtime and pattern count when lowering </w:t>
+          <w:rFonts w:ascii="Century Schoolbook" w:hAnsi="Century Schoolbook" w:hint="eastAsia"/>
+        </w:rPr>
+      </w:pPr>
+      <w:r>
+        <w:rPr>
+          <w:rFonts w:ascii="Century Schoolbook" w:hAnsi="Century Schoolbook"/>
+          <w:b/>
+          <w:bCs/>
+        </w:rPr>
+        <w:t xml:space="preserve">Answer (1) — Runtime and pattern count when lowering </w:t>
       </w:r>
       <w:proofErr w:type="spellStart"/>
       <w:r>
@@ -3968,44 +4613,54 @@
         </w:rPr>
         <w:t>:</w:t>
       </w:r>
-    </w:p>
-    <w:p>
-      <w:pPr>
-        <w:jc w:val="both"/>
-        <w:rPr>
-          <w:rFonts w:ascii="Century Schoolbook" w:hAnsi="Century Schoolbook"/>
-        </w:rPr>
-      </w:pPr>
-      <w:r>
-        <w:rPr>
-          <w:rFonts w:ascii="Century Schoolbook" w:hAnsi="Century Schoolbook"/>
-          <w:b/>
-          <w:bCs/>
-        </w:rPr>
-        <w:t>Answer (</w:t>
-      </w:r>
-      <w:proofErr w:type="gramStart"/>
-      <w:r>
-        <w:rPr>
-          <w:rFonts w:ascii="Century Schoolbook" w:hAnsi="Century Schoolbook"/>
-          <w:b/>
-          <w:bCs/>
-        </w:rPr>
-        <w:t>2) —</w:t>
-      </w:r>
-      <w:proofErr w:type="gramEnd"/>
-      <w:r>
-        <w:rPr>
-          <w:rFonts w:ascii="Century Schoolbook" w:hAnsi="Century Schoolbook"/>
-          <w:b/>
-          <w:bCs/>
-        </w:rPr>
-        <w:t xml:space="preserve"> Top-K k vs </w:t>
+      <w:r>
+        <w:rPr>
+          <w:rFonts w:ascii="Century Schoolbook" w:hAnsi="Century Schoolbook" w:hint="eastAsia"/>
+          <w:b/>
+          <w:bCs/>
+        </w:rPr>
+        <w:t xml:space="preserve"> </w:t>
+      </w:r>
+      <w:r>
+        <w:rPr>
+          <w:rFonts w:ascii="Century Schoolbook" w:hAnsi="Century Schoolbook"/>
+        </w:rPr>
+        <w:t xml:space="preserve">Runtime and pattern count: Lowering </w:t>
       </w:r>
       <w:proofErr w:type="spellStart"/>
       <w:r>
         <w:rPr>
           <w:rFonts w:ascii="Century Schoolbook" w:hAnsi="Century Schoolbook"/>
+        </w:rPr>
+        <w:t>minSup</w:t>
+      </w:r>
+      <w:proofErr w:type="spellEnd"/>
+      <w:r>
+        <w:rPr>
+          <w:rFonts w:ascii="Century Schoolbook" w:hAnsi="Century Schoolbook"/>
+        </w:rPr>
+        <w:t xml:space="preserve"> from 9 to 3 increased the number of patterns from 710 to 9,547. The runtime also increased from about 0.08 to 2.64 seconds.</w:t>
+      </w:r>
+    </w:p>
+    <w:p>
+      <w:pPr>
+        <w:jc w:val="both"/>
+        <w:rPr>
+          <w:rFonts w:ascii="Century Schoolbook" w:hAnsi="Century Schoolbook" w:hint="eastAsia"/>
+        </w:rPr>
+      </w:pPr>
+      <w:r>
+        <w:rPr>
+          <w:rFonts w:ascii="Century Schoolbook" w:hAnsi="Century Schoolbook"/>
+          <w:b/>
+          <w:bCs/>
+        </w:rPr>
+        <w:t xml:space="preserve">Answer (2) — Top-K k vs </w:t>
+      </w:r>
+      <w:proofErr w:type="spellStart"/>
+      <w:r>
+        <w:rPr>
+          <w:rFonts w:ascii="Century Schoolbook" w:hAnsi="Century Schoolbook"/>
           <w:b/>
           <w:bCs/>
         </w:rPr>
@@ -4038,39 +4693,64 @@
         </w:rPr>
         <w:t>:</w:t>
       </w:r>
-    </w:p>
-    <w:p>
-      <w:pPr>
-        <w:jc w:val="both"/>
-        <w:rPr>
-          <w:rFonts w:ascii="Century Schoolbook" w:hAnsi="Century Schoolbook"/>
-        </w:rPr>
-      </w:pPr>
-      <w:r>
-        <w:rPr>
-          <w:rFonts w:ascii="Century Schoolbook" w:hAnsi="Century Schoolbook"/>
-          <w:b/>
-          <w:bCs/>
-        </w:rPr>
-        <w:t>Answer (</w:t>
-      </w:r>
-      <w:proofErr w:type="gramStart"/>
-      <w:r>
-        <w:rPr>
-          <w:rFonts w:ascii="Century Schoolbook" w:hAnsi="Century Schoolbook"/>
-          <w:b/>
-          <w:bCs/>
-        </w:rPr>
-        <w:t>3) —</w:t>
-      </w:r>
-      <w:proofErr w:type="gramEnd"/>
-      <w:r>
-        <w:rPr>
-          <w:rFonts w:ascii="Century Schoolbook" w:hAnsi="Century Schoolbook"/>
-          <w:b/>
-          <w:bCs/>
-        </w:rPr>
-        <w:t xml:space="preserve"> Maximal vs standard frequent patterns:</w:t>
+      <w:r>
+        <w:rPr>
+          <w:rFonts w:ascii="Century Schoolbook" w:hAnsi="Century Schoolbook" w:hint="eastAsia"/>
+          <w:b/>
+          <w:bCs/>
+        </w:rPr>
+        <w:t xml:space="preserve"> </w:t>
+      </w:r>
+      <w:r>
+        <w:rPr>
+          <w:rFonts w:ascii="Century Schoolbook" w:hAnsi="Century Schoolbook"/>
+        </w:rPr>
+        <w:t xml:space="preserve">Top-K FAE keeps the k most frequent patterns, while </w:t>
+      </w:r>
+      <w:proofErr w:type="spellStart"/>
+      <w:r>
+        <w:rPr>
+          <w:rFonts w:ascii="Century Schoolbook" w:hAnsi="Century Schoolbook"/>
+        </w:rPr>
+        <w:t>MaxFPGrowth</w:t>
+      </w:r>
+      <w:proofErr w:type="spellEnd"/>
+      <w:r>
+        <w:rPr>
+          <w:rFonts w:ascii="Century Schoolbook" w:hAnsi="Century Schoolbook"/>
+        </w:rPr>
+        <w:t xml:space="preserve"> uses a minimum support threshold and keeps only maximal frequent patterns.</w:t>
+      </w:r>
+    </w:p>
+    <w:p>
+      <w:pPr>
+        <w:jc w:val="both"/>
+        <w:rPr>
+          <w:rFonts w:ascii="Century Schoolbook" w:hAnsi="Century Schoolbook"/>
+        </w:rPr>
+      </w:pPr>
+      <w:r>
+        <w:rPr>
+          <w:rFonts w:ascii="Century Schoolbook" w:hAnsi="Century Schoolbook"/>
+          <w:b/>
+          <w:bCs/>
+        </w:rPr>
+        <w:t xml:space="preserve">Answer (3) — </w:t>
+      </w:r>
+      <w:r>
+        <w:rPr>
+          <w:rFonts w:ascii="Century Schoolbook" w:hAnsi="Century Schoolbook"/>
+        </w:rPr>
+        <w:t>Maximal vs standard frequent patterns:</w:t>
+      </w:r>
+      <w:r>
+        <w:t xml:space="preserve"> </w:t>
+      </w:r>
+      <w:r>
+        <w:rPr>
+          <w:rFonts w:ascii="Century Schoolbook" w:hAnsi="Century Schoolbook"/>
+        </w:rPr>
+        <w:t>Maximal frequent patterns are more concise because they exclude frequent subsets that are already contained in larger frequent patterns.</w:t>
       </w:r>
     </w:p>
     <w:p>
@@ -4092,22 +4772,23 @@
         <w:rPr>
           <w:rFonts w:ascii="Century Schoolbook" w:hAnsi="Century Schoolbook"/>
         </w:rPr>
-        <w:t xml:space="preserve"> Yes / No </w:t>
-      </w:r>
-    </w:p>
-    <w:p>
-      <w:pPr>
-        <w:jc w:val="both"/>
-        <w:rPr>
-          <w:rFonts w:ascii="Century Schoolbook" w:hAnsi="Century Schoolbook"/>
-        </w:rPr>
-      </w:pPr>
-      <w:r>
-        <w:rPr>
-          <w:rFonts w:ascii="Century Schoolbook" w:hAnsi="Century Schoolbook"/>
-          <w:b/>
-          <w:bCs/>
-        </w:rPr>
+        <w:t xml:space="preserve"> Yes </w:t>
+      </w:r>
+    </w:p>
+    <w:p>
+      <w:pPr>
+        <w:jc w:val="both"/>
+        <w:rPr>
+          <w:rFonts w:ascii="Century Schoolbook" w:hAnsi="Century Schoolbook"/>
+        </w:rPr>
+      </w:pPr>
+      <w:r>
+        <w:rPr>
+          <w:rFonts w:ascii="Century Schoolbook" w:hAnsi="Century Schoolbook"/>
+          <w:b/>
+          <w:bCs/>
+        </w:rPr>
+        <w:lastRenderedPageBreak/>
         <w:t>If yes, how:</w:t>
       </w:r>
       <w:r>
@@ -4116,6 +4797,34 @@
         </w:rPr>
         <w:t xml:space="preserve"> </w:t>
       </w:r>
+      <w:r>
+        <w:rPr>
+          <w:rFonts w:ascii="Century Schoolbook" w:hAnsi="Century Schoolbook"/>
+        </w:rPr>
+        <w:t xml:space="preserve">I used ChatGPT to understand the differences between Top-K FAE and </w:t>
+      </w:r>
+      <w:proofErr w:type="spellStart"/>
+      <w:r>
+        <w:rPr>
+          <w:rFonts w:ascii="Century Schoolbook" w:hAnsi="Century Schoolbook"/>
+        </w:rPr>
+        <w:t>MaxFPGrowth</w:t>
+      </w:r>
+      <w:proofErr w:type="spellEnd"/>
+      <w:r>
+        <w:rPr>
+          <w:rFonts w:ascii="Century Schoolbook" w:hAnsi="Century Schoolbook"/>
+        </w:rPr>
+        <w:t>, fix coding errors, and compare the experimental results. I wrote the final answers based on the actual outputs.</w:t>
+      </w:r>
+    </w:p>
+    <w:p>
+      <w:pPr>
+        <w:jc w:val="both"/>
+        <w:rPr>
+          <w:rFonts w:ascii="Century Schoolbook" w:hAnsi="Century Schoolbook"/>
+        </w:rPr>
+      </w:pPr>
     </w:p>
     <w:p>
       <w:pPr>
@@ -4138,6 +4847,88 @@
         </w:rPr>
         <w:t xml:space="preserve"> </w:t>
       </w:r>
+    </w:p>
+    <w:p>
+      <w:pPr>
+        <w:jc w:val="both"/>
+        <w:rPr>
+          <w:rFonts w:ascii="Century Schoolbook" w:hAnsi="Century Schoolbook"/>
+        </w:rPr>
+      </w:pPr>
+      <w:r>
+        <w:rPr>
+          <w:rFonts w:ascii="Century Schoolbook" w:hAnsi="Century Schoolbook"/>
+        </w:rPr>
+        <w:t xml:space="preserve">1. PAMI – Frequent Pattern Mining (Top-K FAE and </w:t>
+      </w:r>
+      <w:proofErr w:type="spellStart"/>
+      <w:r>
+        <w:rPr>
+          <w:rFonts w:ascii="Century Schoolbook" w:hAnsi="Century Schoolbook"/>
+        </w:rPr>
+        <w:t>MaxFPGrowth</w:t>
+      </w:r>
+      <w:proofErr w:type="spellEnd"/>
+      <w:r>
+        <w:rPr>
+          <w:rFonts w:ascii="Century Schoolbook" w:hAnsi="Century Schoolbook"/>
+        </w:rPr>
+        <w:t xml:space="preserve">) </w:t>
+      </w:r>
+      <w:hyperlink r:id="rId7" w:history="1">
+        <w:r>
+          <w:rPr>
+            <w:rStyle w:val="af2"/>
+            <w:rFonts w:ascii="Century Schoolbook" w:hAnsi="Century Schoolbook"/>
+          </w:rPr>
+          <w:t>https://pami-1.readthedocs.io/en/latest/frequentPatternMining.html</w:t>
+        </w:r>
+      </w:hyperlink>
+    </w:p>
+    <w:p>
+      <w:pPr>
+        <w:jc w:val="both"/>
+        <w:rPr>
+          <w:rFonts w:ascii="Century Schoolbook" w:hAnsi="Century Schoolbook"/>
+        </w:rPr>
+      </w:pPr>
+      <w:r>
+        <w:rPr>
+          <w:rFonts w:ascii="Century Schoolbook" w:hAnsi="Century Schoolbook"/>
+        </w:rPr>
+        <w:t xml:space="preserve">2. PAMI – </w:t>
+      </w:r>
+      <w:proofErr w:type="spellStart"/>
+      <w:r>
+        <w:rPr>
+          <w:rFonts w:ascii="Century Schoolbook" w:hAnsi="Century Schoolbook"/>
+        </w:rPr>
+        <w:t>MaxFPGrowth</w:t>
+      </w:r>
+      <w:proofErr w:type="spellEnd"/>
+      <w:r>
+        <w:rPr>
+          <w:rFonts w:ascii="Century Schoolbook" w:hAnsi="Century Schoolbook"/>
+        </w:rPr>
+        <w:t xml:space="preserve"> Documentation </w:t>
+      </w:r>
+      <w:hyperlink r:id="rId8" w:history="1">
+        <w:r>
+          <w:rPr>
+            <w:rStyle w:val="af2"/>
+            <w:rFonts w:ascii="Century Schoolbook" w:hAnsi="Century Schoolbook"/>
+          </w:rPr>
+          <w:t>https://udaylab.github.io/PAMI/html/frequentPatternMaximalmaxFPGrowth.html</w:t>
+        </w:r>
+      </w:hyperlink>
+    </w:p>
+    <w:p>
+      <w:pPr>
+        <w:jc w:val="both"/>
+        <w:rPr>
+          <w:rFonts w:ascii="Century Schoolbook" w:hAnsi="Century Schoolbook"/>
+        </w:rPr>
+      </w:pPr>
     </w:p>
     <w:p>
       <w:pPr>
@@ -4170,7 +4961,6 @@
           <w:b/>
           <w:bCs/>
         </w:rPr>
-        <w:lastRenderedPageBreak/>
         <w:t>Question 8: Dimensionality Reduction — Motivation</w:t>
       </w:r>
     </w:p>
@@ -4254,7 +5044,7 @@
     </w:p>
     <w:p>
       <w:pPr>
-        <w:pStyle w:val="ListParagraph"/>
+        <w:pStyle w:val="a9"/>
         <w:numPr>
           <w:ilvl w:val="0"/>
           <w:numId w:val="20"/>
@@ -4289,7 +5079,7 @@
     </w:p>
     <w:p>
       <w:pPr>
-        <w:pStyle w:val="ListParagraph"/>
+        <w:pStyle w:val="a9"/>
         <w:numPr>
           <w:ilvl w:val="0"/>
           <w:numId w:val="20"/>
@@ -4308,9 +5098,14 @@
     </w:p>
     <w:p>
       <w:pPr>
-        <w:jc w:val="both"/>
-        <w:rPr>
-          <w:rFonts w:ascii="Century Schoolbook" w:hAnsi="Century Schoolbook"/>
+        <w:tabs>
+          <w:tab w:val="left" w:pos="1965"/>
+        </w:tabs>
+        <w:jc w:val="both"/>
+        <w:rPr>
+          <w:rFonts w:ascii="Century Schoolbook" w:hAnsi="Century Schoolbook"/>
+          <w:b/>
+          <w:bCs/>
         </w:rPr>
       </w:pPr>
       <w:r>
@@ -4321,6 +5116,122 @@
         </w:rPr>
         <w:t>Answer:</w:t>
       </w:r>
+      <w:r>
+        <w:rPr>
+          <w:rFonts w:ascii="Century Schoolbook" w:hAnsi="Century Schoolbook"/>
+          <w:b/>
+          <w:bCs/>
+        </w:rPr>
+        <w:tab/>
+      </w:r>
+    </w:p>
+    <w:p>
+      <w:pPr>
+        <w:pStyle w:val="a9"/>
+        <w:numPr>
+          <w:ilvl w:val="0"/>
+          <w:numId w:val="25"/>
+        </w:numPr>
+        <w:tabs>
+          <w:tab w:val="left" w:pos="1965"/>
+        </w:tabs>
+        <w:jc w:val="both"/>
+        <w:rPr>
+          <w:rFonts w:ascii="Century Schoolbook" w:hAnsi="Century Schoolbook"/>
+          <w:b/>
+          <w:bCs/>
+        </w:rPr>
+      </w:pPr>
+      <w:r>
+        <w:rPr>
+          <w:rFonts w:ascii="Century Schoolbook" w:hAnsi="Century Schoolbook"/>
+          <w:b/>
+          <w:bCs/>
+        </w:rPr>
+        <w:t xml:space="preserve">The </w:t>
+      </w:r>
+      <w:proofErr w:type="spellStart"/>
+      <w:r>
+        <w:rPr>
+          <w:rFonts w:ascii="Century Schoolbook" w:hAnsi="Century Schoolbook"/>
+          <w:b/>
+          <w:bCs/>
+        </w:rPr>
+        <w:t>X_counts</w:t>
+      </w:r>
+      <w:proofErr w:type="spellEnd"/>
+      <w:r>
+        <w:rPr>
+          <w:rFonts w:ascii="Century Schoolbook" w:hAnsi="Century Schoolbook"/>
+          <w:b/>
+          <w:bCs/>
+        </w:rPr>
+        <w:t xml:space="preserve"> matrix contains thousands of features, meaning each document is represented in a high-dimensional space. A normal scatter plot can only display 2 or 3 dimensions, so we cannot plot the raw matrix directly.</w:t>
+      </w:r>
+    </w:p>
+    <w:p>
+      <w:pPr>
+        <w:pStyle w:val="a9"/>
+        <w:numPr>
+          <w:ilvl w:val="0"/>
+          <w:numId w:val="25"/>
+        </w:numPr>
+        <w:spacing w:before="100" w:beforeAutospacing="1" w:after="100" w:afterAutospacing="1" w:line="240" w:lineRule="auto"/>
+        <w:rPr>
+          <w:rFonts w:ascii="Century Schoolbook" w:eastAsia="新細明體" w:hAnsi="Century Schoolbook" w:cs="新細明體"/>
+          <w:kern w:val="0"/>
+          <w:sz w:val="24"/>
+          <w:szCs w:val="24"/>
+          <w:lang w:bidi="th-TH"/>
+          <w14:ligatures w14:val="none"/>
+        </w:rPr>
+      </w:pPr>
+      <w:r>
+        <w:rPr>
+          <w:rFonts w:ascii="Century Schoolbook" w:eastAsia="新細明體" w:hAnsi="Century Schoolbook" w:cs="新細明體"/>
+          <w:kern w:val="0"/>
+          <w:sz w:val="24"/>
+          <w:szCs w:val="24"/>
+          <w:lang w:bidi="th-TH"/>
+          <w14:ligatures w14:val="none"/>
+        </w:rPr>
+        <w:t xml:space="preserve">We need to apply  </w:t>
+      </w:r>
+      <w:r>
+        <w:rPr>
+          <w:rFonts w:ascii="Century Schoolbook" w:eastAsia="新細明體" w:hAnsi="Century Schoolbook" w:cs="新細明體" w:hint="eastAsia"/>
+          <w:kern w:val="0"/>
+          <w:sz w:val="24"/>
+          <w:szCs w:val="24"/>
+          <w:lang w:bidi="th-TH"/>
+          <w14:ligatures w14:val="none"/>
+        </w:rPr>
+        <w:t xml:space="preserve">dimensionality reduction </w:t>
+      </w:r>
+      <w:r>
+        <w:rPr>
+          <w:rFonts w:ascii="Century Schoolbook" w:eastAsia="新細明體" w:hAnsi="Century Schoolbook" w:cs="新細明體"/>
+          <w:kern w:val="0"/>
+          <w:sz w:val="24"/>
+          <w:szCs w:val="24"/>
+          <w:lang w:bidi="th-TH"/>
+          <w14:ligatures w14:val="none"/>
+        </w:rPr>
+        <w:t>algorithms, such as PCA, t-SNE, or UMAP, to reduce the data to 2D or 3D for visualization.</w:t>
+      </w:r>
+    </w:p>
+    <w:p>
+      <w:pPr>
+        <w:pStyle w:val="a9"/>
+        <w:tabs>
+          <w:tab w:val="left" w:pos="1965"/>
+        </w:tabs>
+        <w:ind w:left="360"/>
+        <w:jc w:val="both"/>
+        <w:rPr>
+          <w:rFonts w:ascii="Century Schoolbook" w:hAnsi="Century Schoolbook" w:hint="eastAsia"/>
+        </w:rPr>
+      </w:pPr>
     </w:p>
     <w:p>
       <w:pPr>
@@ -4341,7 +5252,7 @@
         <w:rPr>
           <w:rFonts w:ascii="Century Schoolbook" w:hAnsi="Century Schoolbook"/>
         </w:rPr>
-        <w:t xml:space="preserve"> Yes / No </w:t>
+        <w:t xml:space="preserve"> Yes  </w:t>
       </w:r>
     </w:p>
     <w:p>
@@ -4365,6 +5276,20 @@
         </w:rPr>
         <w:t xml:space="preserve"> </w:t>
       </w:r>
+      <w:r>
+        <w:rPr>
+          <w:rFonts w:ascii="Century Schoolbook" w:hAnsi="Century Schoolbook"/>
+        </w:rPr>
+        <w:t>I used ChatGPT to help me understand why dimensionality reduction is necessary and to explain the concepts in simpler English.</w:t>
+      </w:r>
+    </w:p>
+    <w:p>
+      <w:pPr>
+        <w:jc w:val="both"/>
+        <w:rPr>
+          <w:rFonts w:ascii="Century Schoolbook" w:hAnsi="Century Schoolbook"/>
+        </w:rPr>
+      </w:pPr>
     </w:p>
     <w:p>
       <w:pPr>
@@ -4467,6 +5392,7 @@
           <w:b/>
           <w:bCs/>
         </w:rPr>
+        <w:lastRenderedPageBreak/>
         <w:t xml:space="preserve">Task: </w:t>
       </w:r>
       <w:r>
@@ -4536,7 +5462,7 @@
     </w:p>
     <w:p>
       <w:pPr>
-        <w:pStyle w:val="ListParagraph"/>
+        <w:pStyle w:val="a9"/>
         <w:numPr>
           <w:ilvl w:val="0"/>
           <w:numId w:val="21"/>
@@ -4569,7 +5495,7 @@
     </w:p>
     <w:p>
       <w:pPr>
-        <w:pStyle w:val="ListParagraph"/>
+        <w:pStyle w:val="a9"/>
         <w:numPr>
           <w:ilvl w:val="0"/>
           <w:numId w:val="21"/>
@@ -4630,7 +5556,7 @@
     </w:p>
     <w:p>
       <w:pPr>
-        <w:pStyle w:val="ListParagraph"/>
+        <w:pStyle w:val="a9"/>
         <w:numPr>
           <w:ilvl w:val="0"/>
           <w:numId w:val="21"/>
@@ -4666,6 +5592,8 @@
         <w:jc w:val="both"/>
         <w:rPr>
           <w:rFonts w:ascii="Century Schoolbook" w:hAnsi="Century Schoolbook"/>
+          <w:b/>
+          <w:bCs/>
         </w:rPr>
       </w:pPr>
       <w:r>
@@ -4682,6 +5610,113 @@
         <w:jc w:val="both"/>
         <w:rPr>
           <w:rFonts w:ascii="Century Schoolbook" w:hAnsi="Century Schoolbook"/>
+          <w:b/>
+          <w:bCs/>
+        </w:rPr>
+      </w:pPr>
+      <w:r>
+        <w:rPr>
+          <w:rFonts w:ascii="Century Schoolbook" w:hAnsi="Century Schoolbook" w:hint="eastAsia"/>
+          <w:b/>
+          <w:bCs/>
+        </w:rPr>
+        <w:t>1.</w:t>
+      </w:r>
+      <w:r>
+        <w:rPr>
+          <w:rFonts w:ascii="新細明體" w:eastAsia="新細明體" w:hAnsi="新細明體" w:cs="新細明體"/>
+          <w:kern w:val="0"/>
+          <w:sz w:val="24"/>
+          <w:szCs w:val="24"/>
+          <w:lang w:bidi="th-TH"/>
+          <w14:ligatures w14:val="none"/>
+        </w:rPr>
+        <w:t xml:space="preserve"> </w:t>
+      </w:r>
+      <w:r>
+        <w:rPr>
+          <w:rFonts w:ascii="Century Schoolbook" w:hAnsi="Century Schoolbook"/>
+          <w:b/>
+          <w:bCs/>
+        </w:rPr>
+        <w:t>PCA shows heavy overlap near the center. t-SNE and UMAP show some better separation, especially UMAP, but the four categories are still not completely separated.</w:t>
+      </w:r>
+    </w:p>
+    <w:p>
+      <w:pPr>
+        <w:jc w:val="both"/>
+        <w:rPr>
+          <w:rFonts w:ascii="Century Schoolbook" w:hAnsi="Century Schoolbook"/>
+        </w:rPr>
+      </w:pPr>
+      <w:r>
+        <w:rPr>
+          <w:rFonts w:ascii="Century Schoolbook" w:hAnsi="Century Schoolbook" w:hint="eastAsia"/>
+        </w:rPr>
+        <w:t>2.</w:t>
+      </w:r>
+      <w:r>
+        <w:rPr>
+          <w:rFonts w:ascii="新細明體" w:eastAsia="新細明體" w:hAnsi="新細明體" w:cs="新細明體"/>
+          <w:kern w:val="0"/>
+          <w:sz w:val="24"/>
+          <w:szCs w:val="24"/>
+          <w:lang w:bidi="th-TH"/>
+          <w14:ligatures w14:val="none"/>
+        </w:rPr>
+        <w:t xml:space="preserve"> </w:t>
+      </w:r>
+      <w:r>
+        <w:rPr>
+          <w:rFonts w:ascii="Century Schoolbook" w:hAnsi="Century Schoolbook"/>
+        </w:rPr>
+        <w:t>PCA is a linear method that focuses on maximizing variance. However, text data is high-dimensional and may contain nonlinear relationships. t-SNE and UMAP can better preserve local structures.</w:t>
+      </w:r>
+    </w:p>
+    <w:p>
+      <w:pPr>
+        <w:jc w:val="both"/>
+        <w:rPr>
+          <w:rFonts w:ascii="Century Schoolbook" w:hAnsi="Century Schoolbook"/>
+        </w:rPr>
+      </w:pPr>
+      <w:r>
+        <w:rPr>
+          <w:rFonts w:ascii="Century Schoolbook" w:hAnsi="Century Schoolbook" w:hint="eastAsia"/>
+        </w:rPr>
+        <w:t>3.</w:t>
+      </w:r>
+      <w:r>
+        <w:rPr>
+          <w:rFonts w:ascii="新細明體" w:eastAsia="新細明體" w:hAnsi="新細明體" w:cs="新細明體"/>
+          <w:kern w:val="0"/>
+          <w:sz w:val="24"/>
+          <w:szCs w:val="24"/>
+          <w:lang w:bidi="th-TH"/>
+          <w14:ligatures w14:val="none"/>
+        </w:rPr>
+        <w:t xml:space="preserve"> </w:t>
+      </w:r>
+      <w:r>
+        <w:rPr>
+          <w:rFonts w:ascii="Century Schoolbook" w:hAnsi="Century Schoolbook"/>
+        </w:rPr>
+        <w:t>Distances in t-SNE do not necessarily represent the true distances between documents. It mainly preserves local similarities, so large distances between clusters should not be over-interpreted.</w:t>
+      </w:r>
+    </w:p>
+    <w:p>
+      <w:pPr>
+        <w:jc w:val="both"/>
+        <w:rPr>
+          <w:rFonts w:ascii="Century Schoolbook" w:hAnsi="Century Schoolbook" w:hint="eastAsia"/>
+        </w:rPr>
+      </w:pPr>
+    </w:p>
+    <w:p>
+      <w:pPr>
+        <w:jc w:val="both"/>
+        <w:rPr>
+          <w:rFonts w:ascii="Century Schoolbook" w:hAnsi="Century Schoolbook"/>
         </w:rPr>
       </w:pPr>
       <w:r>
@@ -4696,7 +5731,7 @@
         <w:rPr>
           <w:rFonts w:ascii="Century Schoolbook" w:hAnsi="Century Schoolbook"/>
         </w:rPr>
-        <w:t xml:space="preserve"> Yes / No </w:t>
+        <w:t xml:space="preserve">  No </w:t>
       </w:r>
     </w:p>
     <w:p>
@@ -4794,7 +5829,6 @@
         <w:rPr>
           <w:rFonts w:ascii="Century Schoolbook" w:hAnsi="Century Schoolbook"/>
         </w:rPr>
-        <w:lastRenderedPageBreak/>
         <w:pict w14:anchorId="3E56138F">
           <v:rect id="_x0000_i1036" style="width:0;height:1.5pt" o:hralign="center" o:hrstd="t" o:hr="t" fillcolor="#a0a0a0" stroked="f"/>
         </w:pict>
@@ -4912,7 +5946,7 @@
     </w:p>
     <w:p>
       <w:pPr>
-        <w:pStyle w:val="ListParagraph"/>
+        <w:pStyle w:val="a9"/>
         <w:numPr>
           <w:ilvl w:val="0"/>
           <w:numId w:val="23"/>
@@ -4931,7 +5965,7 @@
     </w:p>
     <w:p>
       <w:pPr>
-        <w:pStyle w:val="ListParagraph"/>
+        <w:pStyle w:val="a9"/>
         <w:numPr>
           <w:ilvl w:val="0"/>
           <w:numId w:val="23"/>
@@ -4945,6 +5979,7 @@
         <w:rPr>
           <w:rFonts w:ascii="Century Schoolbook" w:hAnsi="Century Schoolbook"/>
         </w:rPr>
+        <w:lastRenderedPageBreak/>
         <w:t xml:space="preserve">If an algorithm (like linear regression or KNN) is given the raw integer column </w:t>
       </w:r>
       <w:r>
@@ -4964,7 +5999,7 @@
     </w:p>
     <w:p>
       <w:pPr>
-        <w:pStyle w:val="ListParagraph"/>
+        <w:pStyle w:val="a9"/>
         <w:numPr>
           <w:ilvl w:val="0"/>
           <w:numId w:val="23"/>
@@ -4983,18 +6018,20 @@
     </w:p>
     <w:p>
       <w:pPr>
-        <w:pStyle w:val="ListParagraph"/>
-        <w:jc w:val="both"/>
-        <w:rPr>
-          <w:rFonts w:ascii="Century Schoolbook" w:hAnsi="Century Schoolbook"/>
-        </w:rPr>
-      </w:pPr>
-    </w:p>
-    <w:p>
-      <w:pPr>
-        <w:jc w:val="both"/>
-        <w:rPr>
-          <w:rFonts w:ascii="Century Schoolbook" w:hAnsi="Century Schoolbook"/>
+        <w:pStyle w:val="a9"/>
+        <w:jc w:val="both"/>
+        <w:rPr>
+          <w:rFonts w:ascii="Century Schoolbook" w:hAnsi="Century Schoolbook"/>
+        </w:rPr>
+      </w:pPr>
+    </w:p>
+    <w:p>
+      <w:pPr>
+        <w:jc w:val="both"/>
+        <w:rPr>
+          <w:rFonts w:ascii="Century Schoolbook" w:hAnsi="Century Schoolbook"/>
+          <w:b/>
+          <w:bCs/>
         </w:rPr>
       </w:pPr>
       <w:r>
@@ -5015,6 +6052,95 @@
       </w:pPr>
       <w:r>
         <w:rPr>
+          <w:rFonts w:ascii="Century Schoolbook" w:hAnsi="Century Schoolbook" w:hint="eastAsia"/>
+          <w:b/>
+          <w:bCs/>
+        </w:rPr>
+        <w:t>1.</w:t>
+      </w:r>
+      <w:r>
+        <w:rPr>
+          <w:rFonts w:ascii="新細明體" w:eastAsia="新細明體" w:hAnsi="新細明體" w:cs="新細明體"/>
+          <w:kern w:val="0"/>
+          <w:sz w:val="24"/>
+          <w:szCs w:val="24"/>
+          <w:lang w:bidi="th-TH"/>
+          <w14:ligatures w14:val="none"/>
+        </w:rPr>
+        <w:t xml:space="preserve"> </w:t>
+      </w:r>
+      <w:r>
+        <w:rPr>
+          <w:rFonts w:ascii="Century Schoolbook" w:hAnsi="Century Schoolbook"/>
+        </w:rPr>
+        <w:t>Four binary columns are created, one for each category.</w:t>
+      </w:r>
+    </w:p>
+    <w:p>
+      <w:pPr>
+        <w:jc w:val="both"/>
+        <w:rPr>
+          <w:rFonts w:ascii="Century Schoolbook" w:hAnsi="Century Schoolbook"/>
+        </w:rPr>
+      </w:pPr>
+      <w:r>
+        <w:rPr>
+          <w:rFonts w:ascii="Century Schoolbook" w:hAnsi="Century Schoolbook" w:hint="eastAsia"/>
+          <w:b/>
+          <w:bCs/>
+        </w:rPr>
+        <w:t>2.</w:t>
+      </w:r>
+      <w:r>
+        <w:rPr>
+          <w:rFonts w:ascii="新細明體" w:eastAsia="新細明體" w:hAnsi="新細明體" w:cs="新細明體"/>
+          <w:kern w:val="0"/>
+          <w:sz w:val="24"/>
+          <w:szCs w:val="24"/>
+          <w:lang w:bidi="th-TH"/>
+          <w14:ligatures w14:val="none"/>
+        </w:rPr>
+        <w:t xml:space="preserve"> </w:t>
+      </w:r>
+      <w:r>
+        <w:rPr>
+          <w:rFonts w:ascii="Century Schoolbook" w:hAnsi="Century Schoolbook"/>
+        </w:rPr>
+        <w:t>Using raw integers (0, 1, 2, 3) makes the algorithm assume that categories have a meaningful order and distance. For example, category 3 appears farther from category 0 than category 1.</w:t>
+      </w:r>
+    </w:p>
+    <w:p>
+      <w:pPr>
+        <w:jc w:val="both"/>
+        <w:rPr>
+          <w:rFonts w:ascii="Century Schoolbook" w:hAnsi="Century Schoolbook" w:hint="eastAsia"/>
+        </w:rPr>
+      </w:pPr>
+      <w:r>
+        <w:rPr>
+          <w:rFonts w:ascii="Century Schoolbook" w:hAnsi="Century Schoolbook" w:hint="eastAsia"/>
+        </w:rPr>
+        <w:t>3.</w:t>
+      </w:r>
+      <w:r>
+        <w:t xml:space="preserve"> </w:t>
+      </w:r>
+      <w:r>
+        <w:rPr>
+          <w:rFonts w:ascii="Century Schoolbook" w:hAnsi="Century Schoolbook"/>
+        </w:rPr>
+        <w:t>One-hot encoding represents each category as a separate binary vector, such as [1, 0, 0, 0]. This removes the false ordering and makes all categories equally distinct.</w:t>
+      </w:r>
+    </w:p>
+    <w:p>
+      <w:pPr>
+        <w:jc w:val="both"/>
+        <w:rPr>
+          <w:rFonts w:ascii="Century Schoolbook" w:hAnsi="Century Schoolbook"/>
+        </w:rPr>
+      </w:pPr>
+      <w:r>
+        <w:rPr>
           <w:rFonts w:ascii="Century Schoolbook" w:hAnsi="Century Schoolbook"/>
           <w:b/>
           <w:bCs/>
@@ -5025,7 +6151,7 @@
         <w:rPr>
           <w:rFonts w:ascii="Century Schoolbook" w:hAnsi="Century Schoolbook"/>
         </w:rPr>
-        <w:t xml:space="preserve"> Yes / No </w:t>
+        <w:t xml:space="preserve">  No </w:t>
       </w:r>
     </w:p>
     <w:p>
@@ -6216,6 +7342,95 @@
     </w:lvl>
   </w:abstractNum>
   <w:abstractNum w:abstractNumId="9" w15:restartNumberingAfterBreak="0">
+    <w:nsid w:val="48356560"/>
+    <w:multiLevelType w:val="hybridMultilevel"/>
+    <w:tmpl w:val="E1DC52EA"/>
+    <w:lvl w:ilvl="0" w:tplc="4F969828">
+      <w:start w:val="1"/>
+      <w:numFmt w:val="decimal"/>
+      <w:lvlText w:val="%1."/>
+      <w:lvlJc w:val="left"/>
+      <w:pPr>
+        <w:ind w:left="360" w:hanging="360"/>
+      </w:pPr>
+      <w:rPr>
+        <w:rFonts w:hint="default"/>
+      </w:rPr>
+    </w:lvl>
+    <w:lvl w:ilvl="1" w:tplc="04090019" w:tentative="1">
+      <w:start w:val="1"/>
+      <w:numFmt w:val="ideographTraditional"/>
+      <w:lvlText w:val="%2、"/>
+      <w:lvlJc w:val="left"/>
+      <w:pPr>
+        <w:ind w:left="960" w:hanging="480"/>
+      </w:pPr>
+    </w:lvl>
+    <w:lvl w:ilvl="2" w:tplc="0409001B" w:tentative="1">
+      <w:start w:val="1"/>
+      <w:numFmt w:val="lowerRoman"/>
+      <w:lvlText w:val="%3."/>
+      <w:lvlJc w:val="right"/>
+      <w:pPr>
+        <w:ind w:left="1440" w:hanging="480"/>
+      </w:pPr>
+    </w:lvl>
+    <w:lvl w:ilvl="3" w:tplc="0409000F" w:tentative="1">
+      <w:start w:val="1"/>
+      <w:numFmt w:val="decimal"/>
+      <w:lvlText w:val="%4."/>
+      <w:lvlJc w:val="left"/>
+      <w:pPr>
+        <w:ind w:left="1920" w:hanging="480"/>
+      </w:pPr>
+    </w:lvl>
+    <w:lvl w:ilvl="4" w:tplc="04090019" w:tentative="1">
+      <w:start w:val="1"/>
+      <w:numFmt w:val="ideographTraditional"/>
+      <w:lvlText w:val="%5、"/>
+      <w:lvlJc w:val="left"/>
+      <w:pPr>
+        <w:ind w:left="2400" w:hanging="480"/>
+      </w:pPr>
+    </w:lvl>
+    <w:lvl w:ilvl="5" w:tplc="0409001B" w:tentative="1">
+      <w:start w:val="1"/>
+      <w:numFmt w:val="lowerRoman"/>
+      <w:lvlText w:val="%6."/>
+      <w:lvlJc w:val="right"/>
+      <w:pPr>
+        <w:ind w:left="2880" w:hanging="480"/>
+      </w:pPr>
+    </w:lvl>
+    <w:lvl w:ilvl="6" w:tplc="0409000F" w:tentative="1">
+      <w:start w:val="1"/>
+      <w:numFmt w:val="decimal"/>
+      <w:lvlText w:val="%7."/>
+      <w:lvlJc w:val="left"/>
+      <w:pPr>
+        <w:ind w:left="3360" w:hanging="480"/>
+      </w:pPr>
+    </w:lvl>
+    <w:lvl w:ilvl="7" w:tplc="04090019" w:tentative="1">
+      <w:start w:val="1"/>
+      <w:numFmt w:val="ideographTraditional"/>
+      <w:lvlText w:val="%8、"/>
+      <w:lvlJc w:val="left"/>
+      <w:pPr>
+        <w:ind w:left="3840" w:hanging="480"/>
+      </w:pPr>
+    </w:lvl>
+    <w:lvl w:ilvl="8" w:tplc="0409001B" w:tentative="1">
+      <w:start w:val="1"/>
+      <w:numFmt w:val="lowerRoman"/>
+      <w:lvlText w:val="%9."/>
+      <w:lvlJc w:val="right"/>
+      <w:pPr>
+        <w:ind w:left="4320" w:hanging="480"/>
+      </w:pPr>
+    </w:lvl>
+  </w:abstractNum>
+  <w:abstractNum w:abstractNumId="10" w15:restartNumberingAfterBreak="0">
     <w:nsid w:val="4A892D1C"/>
     <w:multiLevelType w:val="hybridMultilevel"/>
     <w:tmpl w:val="6A081320"/>
@@ -6349,7 +7564,7 @@
       </w:rPr>
     </w:lvl>
   </w:abstractNum>
-  <w:abstractNum w:abstractNumId="10" w15:restartNumberingAfterBreak="0">
+  <w:abstractNum w:abstractNumId="11" w15:restartNumberingAfterBreak="0">
     <w:nsid w:val="4DD357A6"/>
     <w:multiLevelType w:val="multilevel"/>
     <w:tmpl w:val="707E0AF4"/>
@@ -6462,7 +7677,7 @@
       </w:pPr>
     </w:lvl>
   </w:abstractNum>
-  <w:abstractNum w:abstractNumId="11" w15:restartNumberingAfterBreak="0">
+  <w:abstractNum w:abstractNumId="12" w15:restartNumberingAfterBreak="0">
     <w:nsid w:val="4FA53F13"/>
     <w:multiLevelType w:val="multilevel"/>
     <w:tmpl w:val="143EEEE0"/>
@@ -6575,7 +7790,7 @@
       </w:pPr>
     </w:lvl>
   </w:abstractNum>
-  <w:abstractNum w:abstractNumId="12" w15:restartNumberingAfterBreak="0">
+  <w:abstractNum w:abstractNumId="13" w15:restartNumberingAfterBreak="0">
     <w:nsid w:val="50686C5F"/>
     <w:multiLevelType w:val="multilevel"/>
     <w:tmpl w:val="9F2C0B54"/>
@@ -6688,7 +7903,7 @@
       </w:pPr>
     </w:lvl>
   </w:abstractNum>
-  <w:abstractNum w:abstractNumId="13" w15:restartNumberingAfterBreak="0">
+  <w:abstractNum w:abstractNumId="14" w15:restartNumberingAfterBreak="0">
     <w:nsid w:val="510B6AF3"/>
     <w:multiLevelType w:val="hybridMultilevel"/>
     <w:tmpl w:val="6B0E57B6"/>
@@ -6828,7 +8043,7 @@
       </w:rPr>
     </w:lvl>
   </w:abstractNum>
-  <w:abstractNum w:abstractNumId="14" w15:restartNumberingAfterBreak="0">
+  <w:abstractNum w:abstractNumId="15" w15:restartNumberingAfterBreak="0">
     <w:nsid w:val="576A4380"/>
     <w:multiLevelType w:val="hybridMultilevel"/>
     <w:tmpl w:val="7F86CB26"/>
@@ -6914,7 +8129,7 @@
       </w:pPr>
     </w:lvl>
   </w:abstractNum>
-  <w:abstractNum w:abstractNumId="15" w15:restartNumberingAfterBreak="0">
+  <w:abstractNum w:abstractNumId="16" w15:restartNumberingAfterBreak="0">
     <w:nsid w:val="600745AA"/>
     <w:multiLevelType w:val="hybridMultilevel"/>
     <w:tmpl w:val="7BCE176C"/>
@@ -7054,7 +8269,7 @@
       </w:rPr>
     </w:lvl>
   </w:abstractNum>
-  <w:abstractNum w:abstractNumId="16" w15:restartNumberingAfterBreak="0">
+  <w:abstractNum w:abstractNumId="17" w15:restartNumberingAfterBreak="0">
     <w:nsid w:val="63660093"/>
     <w:multiLevelType w:val="multilevel"/>
     <w:tmpl w:val="487AC5E8"/>
@@ -7167,7 +8382,7 @@
       </w:pPr>
     </w:lvl>
   </w:abstractNum>
-  <w:abstractNum w:abstractNumId="17" w15:restartNumberingAfterBreak="0">
+  <w:abstractNum w:abstractNumId="18" w15:restartNumberingAfterBreak="0">
     <w:nsid w:val="66633041"/>
     <w:multiLevelType w:val="hybridMultilevel"/>
     <w:tmpl w:val="F3BAEAD8"/>
@@ -7307,7 +8522,7 @@
       </w:rPr>
     </w:lvl>
   </w:abstractNum>
-  <w:abstractNum w:abstractNumId="18" w15:restartNumberingAfterBreak="0">
+  <w:abstractNum w:abstractNumId="19" w15:restartNumberingAfterBreak="0">
     <w:nsid w:val="67445AD2"/>
     <w:multiLevelType w:val="hybridMultilevel"/>
     <w:tmpl w:val="C4DE3054"/>
@@ -7447,7 +8662,7 @@
       </w:rPr>
     </w:lvl>
   </w:abstractNum>
-  <w:abstractNum w:abstractNumId="19" w15:restartNumberingAfterBreak="0">
+  <w:abstractNum w:abstractNumId="20" w15:restartNumberingAfterBreak="0">
     <w:nsid w:val="6E5869E4"/>
     <w:multiLevelType w:val="multilevel"/>
     <w:tmpl w:val="22AC937C"/>
@@ -7560,7 +8775,7 @@
       </w:pPr>
     </w:lvl>
   </w:abstractNum>
-  <w:abstractNum w:abstractNumId="20" w15:restartNumberingAfterBreak="0">
+  <w:abstractNum w:abstractNumId="21" w15:restartNumberingAfterBreak="0">
     <w:nsid w:val="6F90345B"/>
     <w:multiLevelType w:val="multilevel"/>
     <w:tmpl w:val="76CCD152"/>
@@ -7673,7 +8888,7 @@
       </w:pPr>
     </w:lvl>
   </w:abstractNum>
-  <w:abstractNum w:abstractNumId="21" w15:restartNumberingAfterBreak="0">
+  <w:abstractNum w:abstractNumId="22" w15:restartNumberingAfterBreak="0">
     <w:nsid w:val="745C3AEA"/>
     <w:multiLevelType w:val="hybridMultilevel"/>
     <w:tmpl w:val="AB2AF8BA"/>
@@ -7786,7 +9001,7 @@
       </w:rPr>
     </w:lvl>
   </w:abstractNum>
-  <w:abstractNum w:abstractNumId="22" w15:restartNumberingAfterBreak="0">
+  <w:abstractNum w:abstractNumId="23" w15:restartNumberingAfterBreak="0">
     <w:nsid w:val="755D4AD5"/>
     <w:multiLevelType w:val="multilevel"/>
     <w:tmpl w:val="1AF6A79A"/>
@@ -7935,7 +9150,7 @@
       </w:rPr>
     </w:lvl>
   </w:abstractNum>
-  <w:abstractNum w:abstractNumId="23" w15:restartNumberingAfterBreak="0">
+  <w:abstractNum w:abstractNumId="24" w15:restartNumberingAfterBreak="0">
     <w:nsid w:val="7D601873"/>
     <w:multiLevelType w:val="multilevel"/>
     <w:tmpl w:val="6660EE9E"/>
@@ -8088,13 +9303,13 @@
     <w:abstractNumId w:val="7"/>
   </w:num>
   <w:num w:numId="2" w16cid:durableId="184292703">
-    <w:abstractNumId w:val="12"/>
+    <w:abstractNumId w:val="13"/>
   </w:num>
   <w:num w:numId="3" w16cid:durableId="1575118697">
     <w:abstractNumId w:val="0"/>
   </w:num>
   <w:num w:numId="4" w16cid:durableId="731463887">
-    <w:abstractNumId w:val="22"/>
+    <w:abstractNumId w:val="23"/>
   </w:num>
   <w:num w:numId="5" w16cid:durableId="619185889">
     <w:abstractNumId w:val="2"/>
@@ -8103,46 +9318,46 @@
     <w:abstractNumId w:val="5"/>
   </w:num>
   <w:num w:numId="7" w16cid:durableId="1588727719">
-    <w:abstractNumId w:val="20"/>
+    <w:abstractNumId w:val="21"/>
   </w:num>
   <w:num w:numId="8" w16cid:durableId="533738981">
     <w:abstractNumId w:val="8"/>
   </w:num>
   <w:num w:numId="9" w16cid:durableId="1269434050">
-    <w:abstractNumId w:val="19"/>
+    <w:abstractNumId w:val="20"/>
   </w:num>
   <w:num w:numId="10" w16cid:durableId="1732079054">
-    <w:abstractNumId w:val="16"/>
+    <w:abstractNumId w:val="17"/>
   </w:num>
   <w:num w:numId="11" w16cid:durableId="1035348155">
-    <w:abstractNumId w:val="10"/>
+    <w:abstractNumId w:val="11"/>
   </w:num>
   <w:num w:numId="12" w16cid:durableId="1142964469">
-    <w:abstractNumId w:val="11"/>
+    <w:abstractNumId w:val="12"/>
   </w:num>
   <w:num w:numId="13" w16cid:durableId="1675378421">
-    <w:abstractNumId w:val="23"/>
+    <w:abstractNumId w:val="24"/>
   </w:num>
   <w:num w:numId="14" w16cid:durableId="815490794">
-    <w:abstractNumId w:val="21"/>
+    <w:abstractNumId w:val="22"/>
   </w:num>
   <w:num w:numId="15" w16cid:durableId="1567035629">
     <w:abstractNumId w:val="3"/>
   </w:num>
   <w:num w:numId="16" w16cid:durableId="1944191802">
-    <w:abstractNumId w:val="13"/>
+    <w:abstractNumId w:val="14"/>
   </w:num>
   <w:num w:numId="17" w16cid:durableId="467089125">
-    <w:abstractNumId w:val="15"/>
+    <w:abstractNumId w:val="16"/>
   </w:num>
   <w:num w:numId="18" w16cid:durableId="771702364">
-    <w:abstractNumId w:val="18"/>
+    <w:abstractNumId w:val="19"/>
   </w:num>
   <w:num w:numId="19" w16cid:durableId="893585597">
-    <w:abstractNumId w:val="9"/>
+    <w:abstractNumId w:val="10"/>
   </w:num>
   <w:num w:numId="20" w16cid:durableId="5520643">
-    <w:abstractNumId w:val="14"/>
+    <w:abstractNumId w:val="15"/>
   </w:num>
   <w:num w:numId="21" w16cid:durableId="1673995430">
     <w:abstractNumId w:val="4"/>
@@ -8154,7 +9369,10 @@
     <w:abstractNumId w:val="6"/>
   </w:num>
   <w:num w:numId="24" w16cid:durableId="1413353911">
-    <w:abstractNumId w:val="17"/>
+    <w:abstractNumId w:val="18"/>
+  </w:num>
+  <w:num w:numId="25" w16cid:durableId="396828190">
+    <w:abstractNumId w:val="9"/>
   </w:num>
 </w:numbering>
 </file>
@@ -8556,15 +9774,15 @@
     <w:lsdException w:name="Unresolved Mention" w:semiHidden="1" w:unhideWhenUsed="1"/>
     <w:lsdException w:name="Smart Link" w:semiHidden="1" w:unhideWhenUsed="1"/>
   </w:latentStyles>
-  <w:style w:type="paragraph" w:default="1" w:styleId="Normal">
+  <w:style w:type="paragraph" w:default="1" w:styleId="a">
     <w:name w:val="Normal"/>
     <w:qFormat/>
   </w:style>
-  <w:style w:type="paragraph" w:styleId="Heading1">
+  <w:style w:type="paragraph" w:styleId="1">
     <w:name w:val="heading 1"/>
-    <w:basedOn w:val="Normal"/>
-    <w:next w:val="Normal"/>
-    <w:link w:val="Heading1Char"/>
+    <w:basedOn w:val="a"/>
+    <w:next w:val="a"/>
+    <w:link w:val="10"/>
     <w:uiPriority w:val="9"/>
     <w:qFormat/>
     <w:rsid w:val="0018685D"/>
@@ -8581,11 +9799,11 @@
       <w:szCs w:val="40"/>
     </w:rPr>
   </w:style>
-  <w:style w:type="paragraph" w:styleId="Heading2">
+  <w:style w:type="paragraph" w:styleId="2">
     <w:name w:val="heading 2"/>
-    <w:basedOn w:val="Normal"/>
-    <w:next w:val="Normal"/>
-    <w:link w:val="Heading2Char"/>
+    <w:basedOn w:val="a"/>
+    <w:next w:val="a"/>
+    <w:link w:val="20"/>
     <w:uiPriority w:val="9"/>
     <w:semiHidden/>
     <w:unhideWhenUsed/>
@@ -8604,11 +9822,11 @@
       <w:szCs w:val="32"/>
     </w:rPr>
   </w:style>
-  <w:style w:type="paragraph" w:styleId="Heading3">
+  <w:style w:type="paragraph" w:styleId="3">
     <w:name w:val="heading 3"/>
-    <w:basedOn w:val="Normal"/>
-    <w:next w:val="Normal"/>
-    <w:link w:val="Heading3Char"/>
+    <w:basedOn w:val="a"/>
+    <w:next w:val="a"/>
+    <w:link w:val="30"/>
     <w:uiPriority w:val="9"/>
     <w:semiHidden/>
     <w:unhideWhenUsed/>
@@ -8627,11 +9845,11 @@
       <w:szCs w:val="28"/>
     </w:rPr>
   </w:style>
-  <w:style w:type="paragraph" w:styleId="Heading4">
+  <w:style w:type="paragraph" w:styleId="4">
     <w:name w:val="heading 4"/>
-    <w:basedOn w:val="Normal"/>
-    <w:next w:val="Normal"/>
-    <w:link w:val="Heading4Char"/>
+    <w:basedOn w:val="a"/>
+    <w:next w:val="a"/>
+    <w:link w:val="40"/>
     <w:uiPriority w:val="9"/>
     <w:semiHidden/>
     <w:unhideWhenUsed/>
@@ -8650,11 +9868,11 @@
       <w:color w:val="0F4761" w:themeColor="accent1" w:themeShade="BF"/>
     </w:rPr>
   </w:style>
-  <w:style w:type="paragraph" w:styleId="Heading5">
+  <w:style w:type="paragraph" w:styleId="5">
     <w:name w:val="heading 5"/>
-    <w:basedOn w:val="Normal"/>
-    <w:next w:val="Normal"/>
-    <w:link w:val="Heading5Char"/>
+    <w:basedOn w:val="a"/>
+    <w:next w:val="a"/>
+    <w:link w:val="50"/>
     <w:uiPriority w:val="9"/>
     <w:semiHidden/>
     <w:unhideWhenUsed/>
@@ -8671,11 +9889,11 @@
       <w:color w:val="0F4761" w:themeColor="accent1" w:themeShade="BF"/>
     </w:rPr>
   </w:style>
-  <w:style w:type="paragraph" w:styleId="Heading6">
+  <w:style w:type="paragraph" w:styleId="6">
     <w:name w:val="heading 6"/>
-    <w:basedOn w:val="Normal"/>
-    <w:next w:val="Normal"/>
-    <w:link w:val="Heading6Char"/>
+    <w:basedOn w:val="a"/>
+    <w:next w:val="a"/>
+    <w:link w:val="60"/>
     <w:uiPriority w:val="9"/>
     <w:semiHidden/>
     <w:unhideWhenUsed/>
@@ -8694,11 +9912,11 @@
       <w:color w:val="595959" w:themeColor="text1" w:themeTint="A6"/>
     </w:rPr>
   </w:style>
-  <w:style w:type="paragraph" w:styleId="Heading7">
+  <w:style w:type="paragraph" w:styleId="7">
     <w:name w:val="heading 7"/>
-    <w:basedOn w:val="Normal"/>
-    <w:next w:val="Normal"/>
-    <w:link w:val="Heading7Char"/>
+    <w:basedOn w:val="a"/>
+    <w:next w:val="a"/>
+    <w:link w:val="70"/>
     <w:uiPriority w:val="9"/>
     <w:semiHidden/>
     <w:unhideWhenUsed/>
@@ -8715,11 +9933,11 @@
       <w:color w:val="595959" w:themeColor="text1" w:themeTint="A6"/>
     </w:rPr>
   </w:style>
-  <w:style w:type="paragraph" w:styleId="Heading8">
+  <w:style w:type="paragraph" w:styleId="8">
     <w:name w:val="heading 8"/>
-    <w:basedOn w:val="Normal"/>
-    <w:next w:val="Normal"/>
-    <w:link w:val="Heading8Char"/>
+    <w:basedOn w:val="a"/>
+    <w:next w:val="a"/>
+    <w:link w:val="80"/>
     <w:uiPriority w:val="9"/>
     <w:semiHidden/>
     <w:unhideWhenUsed/>
@@ -8738,11 +9956,11 @@
       <w:color w:val="272727" w:themeColor="text1" w:themeTint="D8"/>
     </w:rPr>
   </w:style>
-  <w:style w:type="paragraph" w:styleId="Heading9">
+  <w:style w:type="paragraph" w:styleId="9">
     <w:name w:val="heading 9"/>
-    <w:basedOn w:val="Normal"/>
-    <w:next w:val="Normal"/>
-    <w:link w:val="Heading9Char"/>
+    <w:basedOn w:val="a"/>
+    <w:next w:val="a"/>
+    <w:link w:val="90"/>
     <w:uiPriority w:val="9"/>
     <w:semiHidden/>
     <w:unhideWhenUsed/>
@@ -8759,12 +9977,12 @@
       <w:color w:val="272727" w:themeColor="text1" w:themeTint="D8"/>
     </w:rPr>
   </w:style>
-  <w:style w:type="character" w:default="1" w:styleId="DefaultParagraphFont">
+  <w:style w:type="character" w:default="1" w:styleId="a0">
     <w:name w:val="Default Paragraph Font"/>
     <w:uiPriority w:val="1"/>
     <w:unhideWhenUsed/>
   </w:style>
-  <w:style w:type="table" w:default="1" w:styleId="TableNormal">
+  <w:style w:type="table" w:default="1" w:styleId="a1">
     <w:name w:val="Normal Table"/>
     <w:uiPriority w:val="99"/>
     <w:semiHidden/>
@@ -8779,16 +9997,16 @@
       </w:tblCellMar>
     </w:tblPr>
   </w:style>
-  <w:style w:type="numbering" w:default="1" w:styleId="NoList">
+  <w:style w:type="numbering" w:default="1" w:styleId="a2">
     <w:name w:val="No List"/>
     <w:uiPriority w:val="99"/>
     <w:semiHidden/>
     <w:unhideWhenUsed/>
   </w:style>
-  <w:style w:type="character" w:customStyle="1" w:styleId="Heading1Char">
-    <w:name w:val="Heading 1 Char"/>
-    <w:basedOn w:val="DefaultParagraphFont"/>
-    <w:link w:val="Heading1"/>
+  <w:style w:type="character" w:customStyle="1" w:styleId="10">
+    <w:name w:val="標題 1 字元"/>
+    <w:basedOn w:val="a0"/>
+    <w:link w:val="1"/>
     <w:uiPriority w:val="9"/>
     <w:rsid w:val="0018685D"/>
     <w:rPr>
@@ -8798,10 +10016,10 @@
       <w:szCs w:val="40"/>
     </w:rPr>
   </w:style>
-  <w:style w:type="character" w:customStyle="1" w:styleId="Heading2Char">
-    <w:name w:val="Heading 2 Char"/>
-    <w:basedOn w:val="DefaultParagraphFont"/>
-    <w:link w:val="Heading2"/>
+  <w:style w:type="character" w:customStyle="1" w:styleId="20">
+    <w:name w:val="標題 2 字元"/>
+    <w:basedOn w:val="a0"/>
+    <w:link w:val="2"/>
     <w:uiPriority w:val="9"/>
     <w:semiHidden/>
     <w:rsid w:val="0018685D"/>
@@ -8812,10 +10030,10 @@
       <w:szCs w:val="32"/>
     </w:rPr>
   </w:style>
-  <w:style w:type="character" w:customStyle="1" w:styleId="Heading3Char">
-    <w:name w:val="Heading 3 Char"/>
-    <w:basedOn w:val="DefaultParagraphFont"/>
-    <w:link w:val="Heading3"/>
+  <w:style w:type="character" w:customStyle="1" w:styleId="30">
+    <w:name w:val="標題 3 字元"/>
+    <w:basedOn w:val="a0"/>
+    <w:link w:val="3"/>
     <w:uiPriority w:val="9"/>
     <w:semiHidden/>
     <w:rsid w:val="0018685D"/>
@@ -8826,10 +10044,10 @@
       <w:szCs w:val="28"/>
     </w:rPr>
   </w:style>
-  <w:style w:type="character" w:customStyle="1" w:styleId="Heading4Char">
-    <w:name w:val="Heading 4 Char"/>
-    <w:basedOn w:val="DefaultParagraphFont"/>
-    <w:link w:val="Heading4"/>
+  <w:style w:type="character" w:customStyle="1" w:styleId="40">
+    <w:name w:val="標題 4 字元"/>
+    <w:basedOn w:val="a0"/>
+    <w:link w:val="4"/>
     <w:uiPriority w:val="9"/>
     <w:semiHidden/>
     <w:rsid w:val="0018685D"/>
@@ -8840,10 +10058,10 @@
       <w:color w:val="0F4761" w:themeColor="accent1" w:themeShade="BF"/>
     </w:rPr>
   </w:style>
-  <w:style w:type="character" w:customStyle="1" w:styleId="Heading5Char">
-    <w:name w:val="Heading 5 Char"/>
-    <w:basedOn w:val="DefaultParagraphFont"/>
-    <w:link w:val="Heading5"/>
+  <w:style w:type="character" w:customStyle="1" w:styleId="50">
+    <w:name w:val="標題 5 字元"/>
+    <w:basedOn w:val="a0"/>
+    <w:link w:val="5"/>
     <w:uiPriority w:val="9"/>
     <w:semiHidden/>
     <w:rsid w:val="0018685D"/>
@@ -8852,10 +10070,10 @@
       <w:color w:val="0F4761" w:themeColor="accent1" w:themeShade="BF"/>
     </w:rPr>
   </w:style>
-  <w:style w:type="character" w:customStyle="1" w:styleId="Heading6Char">
-    <w:name w:val="Heading 6 Char"/>
-    <w:basedOn w:val="DefaultParagraphFont"/>
-    <w:link w:val="Heading6"/>
+  <w:style w:type="character" w:customStyle="1" w:styleId="60">
+    <w:name w:val="標題 6 字元"/>
+    <w:basedOn w:val="a0"/>
+    <w:link w:val="6"/>
     <w:uiPriority w:val="9"/>
     <w:semiHidden/>
     <w:rsid w:val="0018685D"/>
@@ -8866,10 +10084,10 @@
       <w:color w:val="595959" w:themeColor="text1" w:themeTint="A6"/>
     </w:rPr>
   </w:style>
-  <w:style w:type="character" w:customStyle="1" w:styleId="Heading7Char">
-    <w:name w:val="Heading 7 Char"/>
-    <w:basedOn w:val="DefaultParagraphFont"/>
-    <w:link w:val="Heading7"/>
+  <w:style w:type="character" w:customStyle="1" w:styleId="70">
+    <w:name w:val="標題 7 字元"/>
+    <w:basedOn w:val="a0"/>
+    <w:link w:val="7"/>
     <w:uiPriority w:val="9"/>
     <w:semiHidden/>
     <w:rsid w:val="0018685D"/>
@@ -8878,10 +10096,10 @@
       <w:color w:val="595959" w:themeColor="text1" w:themeTint="A6"/>
     </w:rPr>
   </w:style>
-  <w:style w:type="character" w:customStyle="1" w:styleId="Heading8Char">
-    <w:name w:val="Heading 8 Char"/>
-    <w:basedOn w:val="DefaultParagraphFont"/>
-    <w:link w:val="Heading8"/>
+  <w:style w:type="character" w:customStyle="1" w:styleId="80">
+    <w:name w:val="標題 8 字元"/>
+    <w:basedOn w:val="a0"/>
+    <w:link w:val="8"/>
     <w:uiPriority w:val="9"/>
     <w:semiHidden/>
     <w:rsid w:val="0018685D"/>
@@ -8892,10 +10110,10 @@
       <w:color w:val="272727" w:themeColor="text1" w:themeTint="D8"/>
     </w:rPr>
   </w:style>
-  <w:style w:type="character" w:customStyle="1" w:styleId="Heading9Char">
-    <w:name w:val="Heading 9 Char"/>
-    <w:basedOn w:val="DefaultParagraphFont"/>
-    <w:link w:val="Heading9"/>
+  <w:style w:type="character" w:customStyle="1" w:styleId="90">
+    <w:name w:val="標題 9 字元"/>
+    <w:basedOn w:val="a0"/>
+    <w:link w:val="9"/>
     <w:uiPriority w:val="9"/>
     <w:semiHidden/>
     <w:rsid w:val="0018685D"/>
@@ -8904,11 +10122,11 @@
       <w:color w:val="272727" w:themeColor="text1" w:themeTint="D8"/>
     </w:rPr>
   </w:style>
-  <w:style w:type="paragraph" w:styleId="Title">
+  <w:style w:type="paragraph" w:styleId="a3">
     <w:name w:val="Title"/>
-    <w:basedOn w:val="Normal"/>
-    <w:next w:val="Normal"/>
-    <w:link w:val="TitleChar"/>
+    <w:basedOn w:val="a"/>
+    <w:next w:val="a"/>
+    <w:link w:val="a4"/>
     <w:uiPriority w:val="10"/>
     <w:qFormat/>
     <w:rsid w:val="0018685D"/>
@@ -8924,10 +10142,10 @@
       <w:szCs w:val="56"/>
     </w:rPr>
   </w:style>
-  <w:style w:type="character" w:customStyle="1" w:styleId="TitleChar">
-    <w:name w:val="Title Char"/>
-    <w:basedOn w:val="DefaultParagraphFont"/>
-    <w:link w:val="Title"/>
+  <w:style w:type="character" w:customStyle="1" w:styleId="a4">
+    <w:name w:val="標題 字元"/>
+    <w:basedOn w:val="a0"/>
+    <w:link w:val="a3"/>
     <w:uiPriority w:val="10"/>
     <w:rsid w:val="0018685D"/>
     <w:rPr>
@@ -8938,11 +10156,11 @@
       <w:szCs w:val="56"/>
     </w:rPr>
   </w:style>
-  <w:style w:type="paragraph" w:styleId="Subtitle">
+  <w:style w:type="paragraph" w:styleId="a5">
     <w:name w:val="Subtitle"/>
-    <w:basedOn w:val="Normal"/>
-    <w:next w:val="Normal"/>
-    <w:link w:val="SubtitleChar"/>
+    <w:basedOn w:val="a"/>
+    <w:next w:val="a"/>
+    <w:link w:val="a6"/>
     <w:uiPriority w:val="11"/>
     <w:qFormat/>
     <w:rsid w:val="0018685D"/>
@@ -8959,10 +10177,10 @@
       <w:szCs w:val="28"/>
     </w:rPr>
   </w:style>
-  <w:style w:type="character" w:customStyle="1" w:styleId="SubtitleChar">
-    <w:name w:val="Subtitle Char"/>
-    <w:basedOn w:val="DefaultParagraphFont"/>
-    <w:link w:val="Subtitle"/>
+  <w:style w:type="character" w:customStyle="1" w:styleId="a6">
+    <w:name w:val="副標題 字元"/>
+    <w:basedOn w:val="a0"/>
+    <w:link w:val="a5"/>
     <w:uiPriority w:val="11"/>
     <w:rsid w:val="0018685D"/>
     <w:rPr>
@@ -8973,11 +10191,11 @@
       <w:szCs w:val="28"/>
     </w:rPr>
   </w:style>
-  <w:style w:type="paragraph" w:styleId="Quote">
+  <w:style w:type="paragraph" w:styleId="a7">
     <w:name w:val="Quote"/>
-    <w:basedOn w:val="Normal"/>
-    <w:next w:val="Normal"/>
-    <w:link w:val="QuoteChar"/>
+    <w:basedOn w:val="a"/>
+    <w:next w:val="a"/>
+    <w:link w:val="a8"/>
     <w:uiPriority w:val="29"/>
     <w:qFormat/>
     <w:rsid w:val="0018685D"/>
@@ -8991,10 +10209,10 @@
       <w:color w:val="404040" w:themeColor="text1" w:themeTint="BF"/>
     </w:rPr>
   </w:style>
-  <w:style w:type="character" w:customStyle="1" w:styleId="QuoteChar">
-    <w:name w:val="Quote Char"/>
-    <w:basedOn w:val="DefaultParagraphFont"/>
-    <w:link w:val="Quote"/>
+  <w:style w:type="character" w:customStyle="1" w:styleId="a8">
+    <w:name w:val="引文 字元"/>
+    <w:basedOn w:val="a0"/>
+    <w:link w:val="a7"/>
     <w:uiPriority w:val="29"/>
     <w:rsid w:val="0018685D"/>
     <w:rPr>
@@ -9003,9 +10221,9 @@
       <w:color w:val="404040" w:themeColor="text1" w:themeTint="BF"/>
     </w:rPr>
   </w:style>
-  <w:style w:type="paragraph" w:styleId="ListParagraph">
+  <w:style w:type="paragraph" w:styleId="a9">
     <w:name w:val="List Paragraph"/>
-    <w:basedOn w:val="Normal"/>
+    <w:basedOn w:val="a"/>
     <w:uiPriority w:val="34"/>
     <w:qFormat/>
     <w:rsid w:val="0018685D"/>
@@ -9014,9 +10232,9 @@
       <w:contextualSpacing/>
     </w:pPr>
   </w:style>
-  <w:style w:type="character" w:styleId="IntenseEmphasis">
+  <w:style w:type="character" w:styleId="aa">
     <w:name w:val="Intense Emphasis"/>
-    <w:basedOn w:val="DefaultParagraphFont"/>
+    <w:basedOn w:val="a0"/>
     <w:uiPriority w:val="21"/>
     <w:qFormat/>
     <w:rsid w:val="0018685D"/>
@@ -9026,11 +10244,11 @@
       <w:color w:val="0F4761" w:themeColor="accent1" w:themeShade="BF"/>
     </w:rPr>
   </w:style>
-  <w:style w:type="paragraph" w:styleId="IntenseQuote">
+  <w:style w:type="paragraph" w:styleId="ab">
     <w:name w:val="Intense Quote"/>
-    <w:basedOn w:val="Normal"/>
-    <w:next w:val="Normal"/>
-    <w:link w:val="IntenseQuoteChar"/>
+    <w:basedOn w:val="a"/>
+    <w:next w:val="a"/>
+    <w:link w:val="ac"/>
     <w:uiPriority w:val="30"/>
     <w:qFormat/>
     <w:rsid w:val="0018685D"/>
@@ -9049,10 +10267,10 @@
       <w:color w:val="0F4761" w:themeColor="accent1" w:themeShade="BF"/>
     </w:rPr>
   </w:style>
-  <w:style w:type="character" w:customStyle="1" w:styleId="IntenseQuoteChar">
-    <w:name w:val="Intense Quote Char"/>
-    <w:basedOn w:val="DefaultParagraphFont"/>
-    <w:link w:val="IntenseQuote"/>
+  <w:style w:type="character" w:customStyle="1" w:styleId="ac">
+    <w:name w:val="鮮明引文 字元"/>
+    <w:basedOn w:val="a0"/>
+    <w:link w:val="ab"/>
     <w:uiPriority w:val="30"/>
     <w:rsid w:val="0018685D"/>
     <w:rPr>
@@ -9061,9 +10279,9 @@
       <w:color w:val="0F4761" w:themeColor="accent1" w:themeShade="BF"/>
     </w:rPr>
   </w:style>
-  <w:style w:type="character" w:styleId="IntenseReference">
+  <w:style w:type="character" w:styleId="ad">
     <w:name w:val="Intense Reference"/>
-    <w:basedOn w:val="DefaultParagraphFont"/>
+    <w:basedOn w:val="a0"/>
     <w:uiPriority w:val="32"/>
     <w:qFormat/>
     <w:rsid w:val="0018685D"/>
@@ -9075,9 +10293,9 @@
       <w:spacing w:val="5"/>
     </w:rPr>
   </w:style>
-  <w:style w:type="paragraph" w:styleId="NormalWeb">
+  <w:style w:type="paragraph" w:styleId="Web">
     <w:name w:val="Normal (Web)"/>
-    <w:basedOn w:val="Normal"/>
+    <w:basedOn w:val="a"/>
     <w:uiPriority w:val="99"/>
     <w:semiHidden/>
     <w:unhideWhenUsed/>
@@ -9094,10 +10312,10 @@
       <w14:ligatures w14:val="none"/>
     </w:rPr>
   </w:style>
-  <w:style w:type="paragraph" w:styleId="Header">
+  <w:style w:type="paragraph" w:styleId="ae">
     <w:name w:val="header"/>
-    <w:basedOn w:val="Normal"/>
-    <w:link w:val="HeaderChar"/>
+    <w:basedOn w:val="a"/>
+    <w:link w:val="af"/>
     <w:uiPriority w:val="99"/>
     <w:unhideWhenUsed/>
     <w:rsid w:val="00B11B3A"/>
@@ -9109,17 +10327,17 @@
       <w:spacing w:after="0" w:line="240" w:lineRule="auto"/>
     </w:pPr>
   </w:style>
-  <w:style w:type="character" w:customStyle="1" w:styleId="HeaderChar">
-    <w:name w:val="Header Char"/>
-    <w:basedOn w:val="DefaultParagraphFont"/>
-    <w:link w:val="Header"/>
+  <w:style w:type="character" w:customStyle="1" w:styleId="af">
+    <w:name w:val="頁首 字元"/>
+    <w:basedOn w:val="a0"/>
+    <w:link w:val="ae"/>
     <w:uiPriority w:val="99"/>
     <w:rsid w:val="00B11B3A"/>
   </w:style>
-  <w:style w:type="paragraph" w:styleId="Footer">
+  <w:style w:type="paragraph" w:styleId="af0">
     <w:name w:val="footer"/>
-    <w:basedOn w:val="Normal"/>
-    <w:link w:val="FooterChar"/>
+    <w:basedOn w:val="a"/>
+    <w:link w:val="af1"/>
     <w:uiPriority w:val="99"/>
     <w:unhideWhenUsed/>
     <w:rsid w:val="00B11B3A"/>
@@ -9131,12 +10349,46 @@
       <w:spacing w:after="0" w:line="240" w:lineRule="auto"/>
     </w:pPr>
   </w:style>
-  <w:style w:type="character" w:customStyle="1" w:styleId="FooterChar">
-    <w:name w:val="Footer Char"/>
-    <w:basedOn w:val="DefaultParagraphFont"/>
-    <w:link w:val="Footer"/>
+  <w:style w:type="character" w:customStyle="1" w:styleId="af1">
+    <w:name w:val="頁尾 字元"/>
+    <w:basedOn w:val="a0"/>
+    <w:link w:val="af0"/>
     <w:uiPriority w:val="99"/>
     <w:rsid w:val="00B11B3A"/>
+  </w:style>
+  <w:style w:type="character" w:styleId="af2">
+    <w:name w:val="Hyperlink"/>
+    <w:basedOn w:val="a0"/>
+    <w:uiPriority w:val="99"/>
+    <w:unhideWhenUsed/>
+    <w:rsid w:val="003E760F"/>
+    <w:rPr>
+      <w:color w:val="467886" w:themeColor="hyperlink"/>
+      <w:u w:val="single"/>
+    </w:rPr>
+  </w:style>
+  <w:style w:type="character" w:styleId="af3">
+    <w:name w:val="Unresolved Mention"/>
+    <w:basedOn w:val="a0"/>
+    <w:uiPriority w:val="99"/>
+    <w:semiHidden/>
+    <w:unhideWhenUsed/>
+    <w:rsid w:val="003E760F"/>
+    <w:rPr>
+      <w:color w:val="605E5C"/>
+      <w:shd w:val="clear" w:color="auto" w:fill="E1DFDD"/>
+    </w:rPr>
+  </w:style>
+  <w:style w:type="character" w:styleId="af4">
+    <w:name w:val="Strong"/>
+    <w:basedOn w:val="a0"/>
+    <w:uiPriority w:val="22"/>
+    <w:qFormat/>
+    <w:rsid w:val="003E760F"/>
+    <w:rPr>
+      <w:b/>
+      <w:bCs/>
+    </w:rPr>
   </w:style>
 </w:styles>
 </file>

</xml_diff>